<commit_message>
Essential Open Source v6.21.7
This is the v6.21.7 release. Full release notes are here: https://enterprise-architecture.org/resources/essential-release-notes/#6217-release.
This contains all software up to 6.21.7. It also contains some additional code for NG views which cannot be used at present. These are labelled somename_NG.xsl. Support for these views will come in a future release.
</commit_message>
<xml_diff>
--- a/integration/plus/LaunchpadPlus-Application_Dependencies.docx
+++ b/integration/plus/LaunchpadPlus-Application_Dependencies.docx
@@ -1,6 +1,6 @@
 
 <file path=word/document.xml><?xml version="1.0" encoding="utf-8"?>
-<w:document xmlns:wpc="http://schemas.microsoft.com/office/word/2010/wordprocessingCanvas" xmlns:cx="http://schemas.microsoft.com/office/drawing/2014/chartex" xmlns:cx1="http://schemas.microsoft.com/office/drawing/2015/9/8/chartex" xmlns:cx2="http://schemas.microsoft.com/office/drawing/2015/10/21/chartex" xmlns:cx3="http://schemas.microsoft.com/office/drawing/2016/5/9/chartex" xmlns:cx4="http://schemas.microsoft.com/office/drawing/2016/5/10/chartex" xmlns:cx5="http://schemas.microsoft.com/office/drawing/2016/5/11/chartex" xmlns:cx6="http://schemas.microsoft.com/office/drawing/2016/5/12/chartex" xmlns:cx7="http://schemas.microsoft.com/office/drawing/2016/5/13/chartex" xmlns:cx8="http://schemas.microsoft.com/office/drawing/2016/5/14/chartex" xmlns:mc="http://schemas.openxmlformats.org/markup-compatibility/2006" xmlns:aink="http://schemas.microsoft.com/office/drawing/2016/ink" xmlns:am3d="http://schemas.microsoft.com/office/drawing/2017/model3d" xmlns:o="urn:schemas-microsoft-com:office:office" xmlns:oel="http://schemas.microsoft.com/office/2019/extlst" xmlns:r="http://schemas.openxmlformats.org/officeDocument/2006/relationships" xmlns:m="http://schemas.openxmlformats.org/officeDocument/2006/math" xmlns:v="urn:schemas-microsoft-com:vml" xmlns:wp14="http://schemas.microsoft.com/office/word/2010/wordprocessingDrawing" xmlns:wp="http://schemas.openxmlformats.org/drawingml/2006/wordprocessingDrawing" xmlns:w10="urn:schemas-microsoft-com:office:word" xmlns:w="http://schemas.openxmlformats.org/wordprocessingml/2006/main" xmlns:w14="http://schemas.microsoft.com/office/word/2010/wordml" xmlns:w15="http://schemas.microsoft.com/office/word/2012/wordml" xmlns:w16cex="http://schemas.microsoft.com/office/word/2018/wordml/cex" xmlns:w16cid="http://schemas.microsoft.com/office/word/2016/wordml/cid" xmlns:w16="http://schemas.microsoft.com/office/word/2018/wordml" xmlns:w16sdtdh="http://schemas.microsoft.com/office/word/2020/wordml/sdtdatahash" xmlns:w16se="http://schemas.microsoft.com/office/word/2015/wordml/symex" xmlns:wpg="http://schemas.microsoft.com/office/word/2010/wordprocessingGroup" xmlns:wpi="http://schemas.microsoft.com/office/word/2010/wordprocessingInk" xmlns:wne="http://schemas.microsoft.com/office/word/2006/wordml" xmlns:wps="http://schemas.microsoft.com/office/word/2010/wordprocessingShape" mc:Ignorable="w14 w15 w16se w16cid w16 w16cex w16sdtdh wp14">
+<w:document xmlns:wpc="http://schemas.microsoft.com/office/word/2010/wordprocessingCanvas" xmlns:cx="http://schemas.microsoft.com/office/drawing/2014/chartex" xmlns:cx1="http://schemas.microsoft.com/office/drawing/2015/9/8/chartex" xmlns:cx2="http://schemas.microsoft.com/office/drawing/2015/10/21/chartex" xmlns:cx3="http://schemas.microsoft.com/office/drawing/2016/5/9/chartex" xmlns:cx4="http://schemas.microsoft.com/office/drawing/2016/5/10/chartex" xmlns:cx5="http://schemas.microsoft.com/office/drawing/2016/5/11/chartex" xmlns:cx6="http://schemas.microsoft.com/office/drawing/2016/5/12/chartex" xmlns:cx7="http://schemas.microsoft.com/office/drawing/2016/5/13/chartex" xmlns:cx8="http://schemas.microsoft.com/office/drawing/2016/5/14/chartex" xmlns:mc="http://schemas.openxmlformats.org/markup-compatibility/2006" xmlns:aink="http://schemas.microsoft.com/office/drawing/2016/ink" xmlns:am3d="http://schemas.microsoft.com/office/drawing/2017/model3d" xmlns:o="urn:schemas-microsoft-com:office:office" xmlns:oel="http://schemas.microsoft.com/office/2019/extlst" xmlns:r="http://schemas.openxmlformats.org/officeDocument/2006/relationships" xmlns:m="http://schemas.openxmlformats.org/officeDocument/2006/math" xmlns:v="urn:schemas-microsoft-com:vml" xmlns:wp14="http://schemas.microsoft.com/office/word/2010/wordprocessingDrawing" xmlns:wp="http://schemas.openxmlformats.org/drawingml/2006/wordprocessingDrawing" xmlns:w10="urn:schemas-microsoft-com:office:word" xmlns:w="http://schemas.openxmlformats.org/wordprocessingml/2006/main" xmlns:w14="http://schemas.microsoft.com/office/word/2010/wordml" xmlns:w15="http://schemas.microsoft.com/office/word/2012/wordml" xmlns:w16cex="http://schemas.microsoft.com/office/word/2018/wordml/cex" xmlns:w16cid="http://schemas.microsoft.com/office/word/2016/wordml/cid" xmlns:w16="http://schemas.microsoft.com/office/word/2018/wordml" xmlns:w16du="http://schemas.microsoft.com/office/word/2023/wordml/word16du" xmlns:w16sdtdh="http://schemas.microsoft.com/office/word/2020/wordml/sdtdatahash" xmlns:w16sdtfl="http://schemas.microsoft.com/office/word/2024/wordml/sdtformatlock" xmlns:w16se="http://schemas.microsoft.com/office/word/2015/wordml/symex" xmlns:wpg="http://schemas.microsoft.com/office/word/2010/wordprocessingGroup" xmlns:wpi="http://schemas.microsoft.com/office/word/2010/wordprocessingInk" xmlns:wne="http://schemas.microsoft.com/office/word/2006/wordml" xmlns:wps="http://schemas.microsoft.com/office/word/2010/wordprocessingShape" mc:Ignorable="w14 w15 w16se w16cid w16 w16cex w16sdtdh w16sdtfl w16du wp14">
   <w:body>
     <w:p>
       <w:pPr>
@@ -193,17 +193,9 @@
             <w:sz w:val="22"/>
             <w:szCs w:val="22"/>
           </w:rPr>
-          <w:t>https://university.enterprise-architecture.org/application-information-dependency-model-v2</w:t>
+          <w:t>https://enterprise-architecture.org/university/application-information-dependency-model-v2/</w:t>
         </w:r>
       </w:hyperlink>
-      <w:r>
-        <w:rPr>
-          <w:rFonts w:asciiTheme="minorHAnsi" w:hAnsiTheme="minorHAnsi" w:cstheme="minorHAnsi"/>
-          <w:sz w:val="22"/>
-          <w:szCs w:val="22"/>
-        </w:rPr>
-        <w:t xml:space="preserve"> </w:t>
-      </w:r>
     </w:p>
     <w:p>
       <w:pPr>
@@ -937,16 +929,7 @@
           <w:sz w:val="22"/>
           <w:szCs w:val="22"/>
         </w:rPr>
-        <w:t>Application</w:t>
-      </w:r>
-      <w:r>
-        <w:rPr>
-          <w:rFonts w:asciiTheme="minorHAnsi" w:hAnsiTheme="minorHAnsi" w:cstheme="minorHAnsi"/>
-          <w:b/>
-          <w:sz w:val="22"/>
-          <w:szCs w:val="22"/>
-        </w:rPr>
-        <w:t xml:space="preserve"> Modules</w:t>
+        <w:t>Application Modules</w:t>
       </w:r>
     </w:p>
     <w:p>
@@ -971,23 +954,7 @@
           <w:sz w:val="22"/>
           <w:szCs w:val="22"/>
         </w:rPr>
-        <w:t xml:space="preserve"> may contain existing exported Application Providers, and you can also use it to import additional application</w:t>
-      </w:r>
-      <w:r>
-        <w:rPr>
-          <w:rFonts w:asciiTheme="minorHAnsi" w:hAnsiTheme="minorHAnsi" w:cstheme="minorHAnsi"/>
-          <w:sz w:val="22"/>
-          <w:szCs w:val="22"/>
-        </w:rPr>
-        <w:t xml:space="preserve"> module</w:t>
-      </w:r>
-      <w:r>
-        <w:rPr>
-          <w:rFonts w:asciiTheme="minorHAnsi" w:hAnsiTheme="minorHAnsi" w:cstheme="minorHAnsi"/>
-          <w:sz w:val="22"/>
-          <w:szCs w:val="22"/>
-        </w:rPr>
-        <w:t>s you wish to add.</w:t>
+        <w:t xml:space="preserve"> may contain existing exported Application Providers, and you can also use it to import additional application modules you wish to add.</w:t>
       </w:r>
     </w:p>
     <w:p>
@@ -1249,15 +1216,7 @@
                 <w:sz w:val="22"/>
                 <w:szCs w:val="22"/>
               </w:rPr>
-              <w:t>Application</w:t>
-            </w:r>
-            <w:r>
-              <w:rPr>
-                <w:rFonts w:asciiTheme="minorHAnsi" w:hAnsiTheme="minorHAnsi" w:cstheme="minorHAnsi"/>
-                <w:sz w:val="22"/>
-                <w:szCs w:val="22"/>
-              </w:rPr>
-              <w:t xml:space="preserve"> Module</w:t>
+              <w:t>Application Module</w:t>
             </w:r>
           </w:p>
         </w:tc>
@@ -1333,15 +1292,7 @@
                 <w:sz w:val="22"/>
                 <w:szCs w:val="22"/>
               </w:rPr>
-              <w:t>Application</w:t>
-            </w:r>
-            <w:r>
-              <w:rPr>
-                <w:rFonts w:asciiTheme="minorHAnsi" w:hAnsiTheme="minorHAnsi" w:cstheme="minorHAnsi"/>
-                <w:sz w:val="22"/>
-                <w:szCs w:val="22"/>
-              </w:rPr>
-              <w:t xml:space="preserve"> Module</w:t>
+              <w:t>Application Module</w:t>
             </w:r>
           </w:p>
         </w:tc>
@@ -1463,39 +1414,7 @@
           <w:sz w:val="22"/>
           <w:szCs w:val="22"/>
         </w:rPr>
-        <w:t>p</w:t>
-      </w:r>
-      <w:r>
-        <w:rPr>
-          <w:rFonts w:asciiTheme="minorHAnsi" w:hAnsiTheme="minorHAnsi" w:cstheme="minorHAnsi"/>
-          <w:sz w:val="22"/>
-          <w:szCs w:val="22"/>
-        </w:rPr>
-        <w:t xml:space="preserve">rovider </w:t>
-      </w:r>
-      <w:r>
-        <w:rPr>
-          <w:rFonts w:asciiTheme="minorHAnsi" w:hAnsiTheme="minorHAnsi" w:cstheme="minorHAnsi"/>
-          <w:sz w:val="22"/>
-          <w:szCs w:val="22"/>
-        </w:rPr>
-        <w:t>i</w:t>
-      </w:r>
-      <w:r>
-        <w:rPr>
-          <w:rFonts w:asciiTheme="minorHAnsi" w:hAnsiTheme="minorHAnsi" w:cstheme="minorHAnsi"/>
-          <w:sz w:val="22"/>
-          <w:szCs w:val="22"/>
-        </w:rPr>
-        <w:t>nterfaces</w:t>
-      </w:r>
-      <w:r>
-        <w:rPr>
-          <w:rFonts w:asciiTheme="minorHAnsi" w:hAnsiTheme="minorHAnsi" w:cstheme="minorHAnsi"/>
-          <w:sz w:val="22"/>
-          <w:szCs w:val="22"/>
-        </w:rPr>
-        <w:t xml:space="preserve"> </w:t>
+        <w:t xml:space="preserve">provider interfaces </w:t>
       </w:r>
       <w:r>
         <w:rPr>
@@ -1774,15 +1693,7 @@
                 <w:sz w:val="22"/>
                 <w:szCs w:val="22"/>
               </w:rPr>
-              <w:t xml:space="preserve"> </w:t>
-            </w:r>
-            <w:r>
-              <w:rPr>
-                <w:rFonts w:asciiTheme="minorHAnsi" w:hAnsiTheme="minorHAnsi" w:cstheme="minorHAnsi"/>
-                <w:sz w:val="22"/>
-                <w:szCs w:val="22"/>
-              </w:rPr>
-              <w:t>Provider Interfaces</w:t>
+              <w:t xml:space="preserve"> Provider Interfaces</w:t>
             </w:r>
           </w:p>
         </w:tc>
@@ -1866,15 +1777,7 @@
                 <w:sz w:val="22"/>
                 <w:szCs w:val="22"/>
               </w:rPr>
-              <w:t xml:space="preserve"> </w:t>
-            </w:r>
-            <w:r>
-              <w:rPr>
-                <w:rFonts w:asciiTheme="minorHAnsi" w:hAnsiTheme="minorHAnsi" w:cstheme="minorHAnsi"/>
-                <w:sz w:val="22"/>
-                <w:szCs w:val="22"/>
-              </w:rPr>
-              <w:t>Provider Interfaces</w:t>
+              <w:t xml:space="preserve"> Provider Interfaces</w:t>
             </w:r>
           </w:p>
         </w:tc>
@@ -1953,55 +1856,7 @@
           <w:sz w:val="22"/>
           <w:szCs w:val="22"/>
         </w:rPr>
-        <w:t xml:space="preserve"> may contain existing exported </w:t>
-      </w:r>
-      <w:r>
-        <w:rPr>
-          <w:rFonts w:asciiTheme="minorHAnsi" w:hAnsiTheme="minorHAnsi" w:cstheme="minorHAnsi"/>
-          <w:sz w:val="22"/>
-          <w:szCs w:val="22"/>
-        </w:rPr>
-        <w:t>Information Representations</w:t>
-      </w:r>
-      <w:r>
-        <w:rPr>
-          <w:rFonts w:asciiTheme="minorHAnsi" w:hAnsiTheme="minorHAnsi" w:cstheme="minorHAnsi"/>
-          <w:sz w:val="22"/>
-          <w:szCs w:val="22"/>
-        </w:rPr>
-        <w:t xml:space="preserve">, and you can also use it to import additional </w:t>
-      </w:r>
-      <w:r>
-        <w:rPr>
-          <w:rFonts w:asciiTheme="minorHAnsi" w:hAnsiTheme="minorHAnsi" w:cstheme="minorHAnsi"/>
-          <w:sz w:val="22"/>
-          <w:szCs w:val="22"/>
-        </w:rPr>
-        <w:t>Information</w:t>
-      </w:r>
-      <w:r>
-        <w:rPr>
-          <w:rFonts w:asciiTheme="minorHAnsi" w:hAnsiTheme="minorHAnsi" w:cstheme="minorHAnsi"/>
-          <w:sz w:val="22"/>
-          <w:szCs w:val="22"/>
-        </w:rPr>
-        <w:t xml:space="preserve"> Representations</w:t>
-      </w:r>
-      <w:r>
-        <w:rPr>
-          <w:rFonts w:asciiTheme="minorHAnsi" w:hAnsiTheme="minorHAnsi" w:cstheme="minorHAnsi"/>
-          <w:sz w:val="22"/>
-          <w:szCs w:val="22"/>
-        </w:rPr>
-        <w:t xml:space="preserve"> </w:t>
-      </w:r>
-      <w:r>
-        <w:rPr>
-          <w:rFonts w:asciiTheme="minorHAnsi" w:hAnsiTheme="minorHAnsi" w:cstheme="minorHAnsi"/>
-          <w:sz w:val="22"/>
-          <w:szCs w:val="22"/>
-        </w:rPr>
-        <w:t>you wish to add.</w:t>
+        <w:t xml:space="preserve"> may contain existing exported Information Representations, and you can also use it to import additional Information Representations you wish to add.</w:t>
       </w:r>
     </w:p>
     <w:p>
@@ -2171,23 +2026,7 @@
                 <w:sz w:val="22"/>
                 <w:szCs w:val="22"/>
               </w:rPr>
-              <w:t xml:space="preserve">If it is blank ensure you add an ID for each instance – you can create an ID, for example, </w:t>
-            </w:r>
-            <w:r>
-              <w:rPr>
-                <w:rFonts w:asciiTheme="minorHAnsi" w:hAnsiTheme="minorHAnsi" w:cstheme="minorHAnsi"/>
-                <w:sz w:val="22"/>
-                <w:szCs w:val="22"/>
-              </w:rPr>
-              <w:t>IR</w:t>
-            </w:r>
-            <w:r>
-              <w:rPr>
-                <w:rFonts w:asciiTheme="minorHAnsi" w:hAnsiTheme="minorHAnsi" w:cstheme="minorHAnsi"/>
-                <w:sz w:val="22"/>
-                <w:szCs w:val="22"/>
-              </w:rPr>
-              <w:t>001, but you must ensure it is unique</w:t>
+              <w:t>If it is blank ensure you add an ID for each instance – you can create an ID, for example, IR001, but you must ensure it is unique</w:t>
             </w:r>
           </w:p>
         </w:tc>
@@ -2403,28 +2242,8 @@
           <w:sz w:val="22"/>
           <w:szCs w:val="22"/>
         </w:rPr>
-        <w:t xml:space="preserve">Application </w:t>
-      </w:r>
-      <w:r>
-        <w:rPr>
-          <w:rFonts w:asciiTheme="minorHAnsi" w:hAnsiTheme="minorHAnsi" w:cstheme="minorHAnsi"/>
-          <w:b/>
-          <w:sz w:val="22"/>
-          <w:szCs w:val="22"/>
-        </w:rPr>
-        <w:t xml:space="preserve">Dependencies </w:t>
-      </w:r>
-      <w:proofErr w:type="gramStart"/>
-      <w:r>
-        <w:rPr>
-          <w:rFonts w:asciiTheme="minorHAnsi" w:hAnsiTheme="minorHAnsi" w:cstheme="minorHAnsi"/>
-          <w:b/>
-          <w:sz w:val="22"/>
-          <w:szCs w:val="22"/>
-        </w:rPr>
-        <w:t>CACA</w:t>
-      </w:r>
-      <w:proofErr w:type="gramEnd"/>
+        <w:t>Application Dependencies CACA</w:t>
+      </w:r>
     </w:p>
     <w:p>
       <w:pPr>
@@ -2448,31 +2267,7 @@
           <w:sz w:val="22"/>
           <w:szCs w:val="22"/>
         </w:rPr>
-        <w:t xml:space="preserve"> </w:t>
-      </w:r>
-      <w:r>
-        <w:rPr>
-          <w:rFonts w:asciiTheme="minorHAnsi" w:hAnsiTheme="minorHAnsi" w:cstheme="minorHAnsi"/>
-          <w:sz w:val="22"/>
-          <w:szCs w:val="22"/>
-        </w:rPr>
-        <w:t xml:space="preserve">is used to capture direct dependencies between </w:t>
-      </w:r>
-      <w:r>
-        <w:rPr>
-          <w:rFonts w:asciiTheme="minorHAnsi" w:hAnsiTheme="minorHAnsi" w:cstheme="minorHAnsi"/>
-          <w:sz w:val="22"/>
-          <w:szCs w:val="22"/>
-        </w:rPr>
-        <w:t>Composite Application Providers</w:t>
-      </w:r>
-      <w:r>
-        <w:rPr>
-          <w:rFonts w:asciiTheme="minorHAnsi" w:hAnsiTheme="minorHAnsi" w:cstheme="minorHAnsi"/>
-          <w:sz w:val="22"/>
-          <w:szCs w:val="22"/>
-        </w:rPr>
-        <w:t>.  It</w:t>
+        <w:t xml:space="preserve"> is used to capture direct dependencies between Composite Application Providers.  It</w:t>
       </w:r>
     </w:p>
     <w:p>
@@ -2489,23 +2284,7 @@
           <w:sz w:val="22"/>
           <w:szCs w:val="22"/>
         </w:rPr>
-        <w:t xml:space="preserve">may contain existing exported </w:t>
-      </w:r>
-      <w:r>
-        <w:rPr>
-          <w:rFonts w:asciiTheme="minorHAnsi" w:hAnsiTheme="minorHAnsi" w:cstheme="minorHAnsi"/>
-          <w:sz w:val="22"/>
-          <w:szCs w:val="22"/>
-        </w:rPr>
-        <w:t>dependencies.  If these are correct there is no need to re-import them, you can either clear them out or make a note of your first new row and import from there.</w:t>
-      </w:r>
-      <w:r>
-        <w:rPr>
-          <w:rFonts w:asciiTheme="minorHAnsi" w:hAnsiTheme="minorHAnsi" w:cstheme="minorHAnsi"/>
-          <w:sz w:val="22"/>
-          <w:szCs w:val="22"/>
-        </w:rPr>
-        <w:t xml:space="preserve"> </w:t>
+        <w:t xml:space="preserve">may contain existing exported dependencies.  If these are correct there is no need to re-import them, you can either clear them out or make a note of your first new row and import from there. </w:t>
       </w:r>
     </w:p>
     <w:p>
@@ -2640,15 +2419,7 @@
                 <w:sz w:val="22"/>
                 <w:szCs w:val="22"/>
               </w:rPr>
-              <w:t xml:space="preserve">Select the source </w:t>
-            </w:r>
-            <w:r>
-              <w:rPr>
-                <w:rFonts w:asciiTheme="minorHAnsi" w:hAnsiTheme="minorHAnsi" w:cstheme="minorHAnsi"/>
-                <w:sz w:val="22"/>
-                <w:szCs w:val="22"/>
-              </w:rPr>
-              <w:t>Composite Application Provider</w:t>
+              <w:t>Select the source Composite Application Provider</w:t>
             </w:r>
           </w:p>
         </w:tc>
@@ -2724,23 +2495,7 @@
                 <w:sz w:val="22"/>
                 <w:szCs w:val="22"/>
               </w:rPr>
-              <w:t xml:space="preserve">Select the </w:t>
-            </w:r>
-            <w:r>
-              <w:rPr>
-                <w:rFonts w:asciiTheme="minorHAnsi" w:hAnsiTheme="minorHAnsi" w:cstheme="minorHAnsi"/>
-                <w:sz w:val="22"/>
-                <w:szCs w:val="22"/>
-              </w:rPr>
-              <w:t>target</w:t>
-            </w:r>
-            <w:r>
-              <w:rPr>
-                <w:rFonts w:asciiTheme="minorHAnsi" w:hAnsiTheme="minorHAnsi" w:cstheme="minorHAnsi"/>
-                <w:sz w:val="22"/>
-                <w:szCs w:val="22"/>
-              </w:rPr>
-              <w:t xml:space="preserve"> Composite Application Provider</w:t>
+              <w:t>Select the target Composite Application Provider</w:t>
             </w:r>
           </w:p>
         </w:tc>
@@ -2932,7 +2687,7 @@
                 <w:sz w:val="22"/>
                 <w:szCs w:val="22"/>
               </w:rPr>
-              <w:t>Frequency</w:t>
+              <w:t>Information Service Quality Value</w:t>
             </w:r>
           </w:p>
         </w:tc>
@@ -2962,7 +2717,7 @@
                 <w:sz w:val="22"/>
                 <w:szCs w:val="22"/>
               </w:rPr>
-              <w:t>frequency of</w:t>
+              <w:t>Information Service Quality Value</w:t>
             </w:r>
             <w:r>
               <w:rPr>
@@ -3024,25 +2779,7 @@
           <w:sz w:val="22"/>
           <w:szCs w:val="22"/>
         </w:rPr>
-        <w:t>Application Dependencies A</w:t>
-      </w:r>
-      <w:r>
-        <w:rPr>
-          <w:rFonts w:asciiTheme="minorHAnsi" w:hAnsiTheme="minorHAnsi" w:cstheme="minorHAnsi"/>
-          <w:b/>
-          <w:sz w:val="22"/>
-          <w:szCs w:val="22"/>
-        </w:rPr>
-        <w:t>P</w:t>
-      </w:r>
-      <w:r>
-        <w:rPr>
-          <w:rFonts w:asciiTheme="minorHAnsi" w:hAnsiTheme="minorHAnsi" w:cstheme="minorHAnsi"/>
-          <w:b/>
-          <w:sz w:val="22"/>
-          <w:szCs w:val="22"/>
-        </w:rPr>
-        <w:t>CA</w:t>
+        <w:t>Application Dependencies APCA</w:t>
       </w:r>
     </w:p>
     <w:p>
@@ -3067,15 +2804,7 @@
           <w:sz w:val="22"/>
           <w:szCs w:val="22"/>
         </w:rPr>
-        <w:t xml:space="preserve"> is used to capture direct dependencies between Application Providers</w:t>
-      </w:r>
-      <w:r>
-        <w:rPr>
-          <w:rFonts w:asciiTheme="minorHAnsi" w:hAnsiTheme="minorHAnsi" w:cstheme="minorHAnsi"/>
-          <w:sz w:val="22"/>
-          <w:szCs w:val="22"/>
-        </w:rPr>
-        <w:t xml:space="preserve"> </w:t>
+        <w:t xml:space="preserve"> is used to capture direct dependencies between Application Providers </w:t>
       </w:r>
       <w:r>
         <w:rPr>
@@ -3364,6 +3093,7 @@
                 <w:sz w:val="22"/>
                 <w:szCs w:val="22"/>
               </w:rPr>
+              <w:lastRenderedPageBreak/>
               <w:t>Information Exchanged</w:t>
             </w:r>
           </w:p>
@@ -3432,7 +3162,6 @@
                 <w:sz w:val="22"/>
                 <w:szCs w:val="22"/>
               </w:rPr>
-              <w:lastRenderedPageBreak/>
               <w:t>Acquisition Method</w:t>
             </w:r>
           </w:p>
@@ -3503,7 +3232,7 @@
                 <w:sz w:val="22"/>
                 <w:szCs w:val="22"/>
               </w:rPr>
-              <w:t>Frequency</w:t>
+              <w:t>Information Service Quality Value</w:t>
             </w:r>
           </w:p>
         </w:tc>
@@ -3525,7 +3254,23 @@
                 <w:sz w:val="22"/>
                 <w:szCs w:val="22"/>
               </w:rPr>
-              <w:t>Select the frequency of for the exchange</w:t>
+              <w:t xml:space="preserve">Select the </w:t>
+            </w:r>
+            <w:r>
+              <w:rPr>
+                <w:rFonts w:asciiTheme="minorHAnsi" w:hAnsiTheme="minorHAnsi" w:cstheme="minorHAnsi"/>
+                <w:sz w:val="22"/>
+                <w:szCs w:val="22"/>
+              </w:rPr>
+              <w:t>Information Service Quality Value for</w:t>
+            </w:r>
+            <w:r>
+              <w:rPr>
+                <w:rFonts w:asciiTheme="minorHAnsi" w:hAnsiTheme="minorHAnsi" w:cstheme="minorHAnsi"/>
+                <w:sz w:val="22"/>
+                <w:szCs w:val="22"/>
+              </w:rPr>
+              <w:t xml:space="preserve"> the exchange</w:t>
             </w:r>
           </w:p>
         </w:tc>
@@ -3577,16 +3322,7 @@
           <w:sz w:val="22"/>
           <w:szCs w:val="22"/>
         </w:rPr>
-        <w:t>Application Dependencies CAA</w:t>
-      </w:r>
-      <w:r>
-        <w:rPr>
-          <w:rFonts w:asciiTheme="minorHAnsi" w:hAnsiTheme="minorHAnsi" w:cstheme="minorHAnsi"/>
-          <w:b/>
-          <w:sz w:val="22"/>
-          <w:szCs w:val="22"/>
-        </w:rPr>
-        <w:t>P</w:t>
+        <w:t>Application Dependencies CAAP</w:t>
       </w:r>
     </w:p>
     <w:p>
@@ -3619,15 +3355,7 @@
           <w:sz w:val="22"/>
           <w:szCs w:val="22"/>
         </w:rPr>
-        <w:t xml:space="preserve"> and </w:t>
-      </w:r>
-      <w:r>
-        <w:rPr>
-          <w:rFonts w:asciiTheme="minorHAnsi" w:hAnsiTheme="minorHAnsi" w:cstheme="minorHAnsi"/>
-          <w:sz w:val="22"/>
-          <w:szCs w:val="22"/>
-        </w:rPr>
-        <w:t>Application Providers</w:t>
+        <w:t xml:space="preserve"> and Application Providers</w:t>
       </w:r>
       <w:r>
         <w:rPr>
@@ -4046,7 +3774,7 @@
                 <w:sz w:val="22"/>
                 <w:szCs w:val="22"/>
               </w:rPr>
-              <w:t>Frequency</w:t>
+              <w:t>Information Service Quality Value</w:t>
             </w:r>
           </w:p>
         </w:tc>
@@ -4068,7 +3796,23 @@
                 <w:sz w:val="22"/>
                 <w:szCs w:val="22"/>
               </w:rPr>
-              <w:t>Select the frequency of for the exchange</w:t>
+              <w:t xml:space="preserve">Select the </w:t>
+            </w:r>
+            <w:r>
+              <w:rPr>
+                <w:rFonts w:asciiTheme="minorHAnsi" w:hAnsiTheme="minorHAnsi" w:cstheme="minorHAnsi"/>
+                <w:sz w:val="22"/>
+                <w:szCs w:val="22"/>
+              </w:rPr>
+              <w:t>Information Service Quality Value for</w:t>
+            </w:r>
+            <w:r>
+              <w:rPr>
+                <w:rFonts w:asciiTheme="minorHAnsi" w:hAnsiTheme="minorHAnsi" w:cstheme="minorHAnsi"/>
+                <w:sz w:val="22"/>
+                <w:szCs w:val="22"/>
+              </w:rPr>
+              <w:t xml:space="preserve"> the exchange</w:t>
             </w:r>
           </w:p>
         </w:tc>
@@ -4120,34 +3864,7 @@
           <w:sz w:val="22"/>
           <w:szCs w:val="22"/>
         </w:rPr>
-        <w:t>Application Dependencies A</w:t>
-      </w:r>
-      <w:r>
-        <w:rPr>
-          <w:rFonts w:asciiTheme="minorHAnsi" w:hAnsiTheme="minorHAnsi" w:cstheme="minorHAnsi"/>
-          <w:b/>
-          <w:sz w:val="22"/>
-          <w:szCs w:val="22"/>
-        </w:rPr>
-        <w:t>P</w:t>
-      </w:r>
-      <w:r>
-        <w:rPr>
-          <w:rFonts w:asciiTheme="minorHAnsi" w:hAnsiTheme="minorHAnsi" w:cstheme="minorHAnsi"/>
-          <w:b/>
-          <w:sz w:val="22"/>
-          <w:szCs w:val="22"/>
-        </w:rPr>
-        <w:t>A</w:t>
-      </w:r>
-      <w:r>
-        <w:rPr>
-          <w:rFonts w:asciiTheme="minorHAnsi" w:hAnsiTheme="minorHAnsi" w:cstheme="minorHAnsi"/>
-          <w:b/>
-          <w:sz w:val="22"/>
-          <w:szCs w:val="22"/>
-        </w:rPr>
-        <w:t>P</w:t>
+        <w:t>Application Dependencies APAP</w:t>
       </w:r>
     </w:p>
     <w:p>
@@ -4583,7 +4300,7 @@
                 <w:sz w:val="22"/>
                 <w:szCs w:val="22"/>
               </w:rPr>
-              <w:t>Frequency</w:t>
+              <w:t>Information Service Quality Value</w:t>
             </w:r>
           </w:p>
         </w:tc>
@@ -4605,7 +4322,23 @@
                 <w:sz w:val="22"/>
                 <w:szCs w:val="22"/>
               </w:rPr>
-              <w:t>Select the frequency of for the exchange</w:t>
+              <w:t xml:space="preserve">Select the </w:t>
+            </w:r>
+            <w:r>
+              <w:rPr>
+                <w:rFonts w:asciiTheme="minorHAnsi" w:hAnsiTheme="minorHAnsi" w:cstheme="minorHAnsi"/>
+                <w:sz w:val="22"/>
+                <w:szCs w:val="22"/>
+              </w:rPr>
+              <w:t>Information Service Quality Value for</w:t>
+            </w:r>
+            <w:r>
+              <w:rPr>
+                <w:rFonts w:asciiTheme="minorHAnsi" w:hAnsiTheme="minorHAnsi" w:cstheme="minorHAnsi"/>
+                <w:sz w:val="22"/>
+                <w:szCs w:val="22"/>
+              </w:rPr>
+              <w:t xml:space="preserve"> the exchange</w:t>
             </w:r>
           </w:p>
         </w:tc>
@@ -4657,37 +4390,8 @@
           <w:sz w:val="22"/>
           <w:szCs w:val="22"/>
         </w:rPr>
-        <w:t>App</w:t>
-      </w:r>
-      <w:r>
-        <w:rPr>
-          <w:rFonts w:asciiTheme="minorHAnsi" w:hAnsiTheme="minorHAnsi" w:cstheme="minorHAnsi"/>
-          <w:b/>
-          <w:sz w:val="22"/>
-          <w:szCs w:val="22"/>
-        </w:rPr>
-        <w:t xml:space="preserve"> Interface </w:t>
-      </w:r>
-      <w:r>
-        <w:rPr>
-          <w:rFonts w:asciiTheme="minorHAnsi" w:hAnsiTheme="minorHAnsi" w:cstheme="minorHAnsi"/>
-          <w:b/>
-          <w:sz w:val="22"/>
-          <w:szCs w:val="22"/>
-        </w:rPr>
-        <w:t xml:space="preserve">Dependencies </w:t>
-      </w:r>
-      <w:proofErr w:type="gramStart"/>
-      <w:r>
-        <w:rPr>
-          <w:rFonts w:asciiTheme="minorHAnsi" w:hAnsiTheme="minorHAnsi" w:cstheme="minorHAnsi"/>
-          <w:b/>
-          <w:sz w:val="22"/>
-          <w:szCs w:val="22"/>
-        </w:rPr>
-        <w:t>CACA</w:t>
-      </w:r>
-      <w:proofErr w:type="gramEnd"/>
+        <w:t>App Interface Dependencies CACA</w:t>
+      </w:r>
     </w:p>
     <w:p>
       <w:pPr>
@@ -4711,23 +4415,7 @@
           <w:sz w:val="22"/>
           <w:szCs w:val="22"/>
         </w:rPr>
-        <w:t xml:space="preserve"> is used to capture dependencies between Composite Application Providers</w:t>
-      </w:r>
-      <w:r>
-        <w:rPr>
-          <w:rFonts w:asciiTheme="minorHAnsi" w:hAnsiTheme="minorHAnsi" w:cstheme="minorHAnsi"/>
-          <w:sz w:val="22"/>
-          <w:szCs w:val="22"/>
-        </w:rPr>
-        <w:t xml:space="preserve"> via an API</w:t>
-      </w:r>
-      <w:r>
-        <w:rPr>
-          <w:rFonts w:asciiTheme="minorHAnsi" w:hAnsiTheme="minorHAnsi" w:cstheme="minorHAnsi"/>
-          <w:sz w:val="22"/>
-          <w:szCs w:val="22"/>
-        </w:rPr>
-        <w:t>.  It</w:t>
+        <w:t xml:space="preserve"> is used to capture dependencies between Composite Application Providers via an API.  It</w:t>
       </w:r>
     </w:p>
     <w:p>
@@ -4803,6 +4491,7 @@
                 <w:sz w:val="22"/>
                 <w:szCs w:val="22"/>
               </w:rPr>
+              <w:lastRenderedPageBreak/>
               <w:t>Field</w:t>
             </w:r>
           </w:p>
@@ -5109,7 +4798,6 @@
                 <w:sz w:val="22"/>
                 <w:szCs w:val="22"/>
               </w:rPr>
-              <w:lastRenderedPageBreak/>
               <w:t>Information Exchanged</w:t>
             </w:r>
           </w:p>
@@ -5340,7 +5028,7 @@
                 <w:sz w:val="22"/>
                 <w:szCs w:val="22"/>
               </w:rPr>
-              <w:t>Frequency</w:t>
+              <w:t>Information Service Quality Value</w:t>
             </w:r>
           </w:p>
         </w:tc>
@@ -5362,7 +5050,23 @@
                 <w:sz w:val="22"/>
                 <w:szCs w:val="22"/>
               </w:rPr>
-              <w:t>Select the frequency of for the exchange</w:t>
+              <w:t xml:space="preserve">Select the </w:t>
+            </w:r>
+            <w:r>
+              <w:rPr>
+                <w:rFonts w:asciiTheme="minorHAnsi" w:hAnsiTheme="minorHAnsi" w:cstheme="minorHAnsi"/>
+                <w:sz w:val="22"/>
+                <w:szCs w:val="22"/>
+              </w:rPr>
+              <w:t>Information Service Quality Value for</w:t>
+            </w:r>
+            <w:r>
+              <w:rPr>
+                <w:rFonts w:asciiTheme="minorHAnsi" w:hAnsiTheme="minorHAnsi" w:cstheme="minorHAnsi"/>
+                <w:sz w:val="22"/>
+                <w:szCs w:val="22"/>
+              </w:rPr>
+              <w:t xml:space="preserve"> the exchange</w:t>
             </w:r>
           </w:p>
         </w:tc>
@@ -5456,15 +5160,7 @@
           <w:sz w:val="22"/>
           <w:szCs w:val="22"/>
         </w:rPr>
-        <w:t xml:space="preserve">and </w:t>
-      </w:r>
-      <w:r>
-        <w:rPr>
-          <w:rFonts w:asciiTheme="minorHAnsi" w:hAnsiTheme="minorHAnsi" w:cstheme="minorHAnsi"/>
-          <w:sz w:val="22"/>
-          <w:szCs w:val="22"/>
-        </w:rPr>
-        <w:t xml:space="preserve">Application Providers </w:t>
+        <w:t xml:space="preserve">and Application Providers </w:t>
       </w:r>
       <w:r>
         <w:rPr>
@@ -6019,7 +5715,7 @@
                 <w:sz w:val="22"/>
                 <w:szCs w:val="22"/>
               </w:rPr>
-              <w:t>Frequency</w:t>
+              <w:t>Information Service Quality Value</w:t>
             </w:r>
           </w:p>
         </w:tc>
@@ -6041,7 +5737,23 @@
                 <w:sz w:val="22"/>
                 <w:szCs w:val="22"/>
               </w:rPr>
-              <w:t>Select the frequency of for the exchange</w:t>
+              <w:t xml:space="preserve">Select the </w:t>
+            </w:r>
+            <w:r>
+              <w:rPr>
+                <w:rFonts w:asciiTheme="minorHAnsi" w:hAnsiTheme="minorHAnsi" w:cstheme="minorHAnsi"/>
+                <w:sz w:val="22"/>
+                <w:szCs w:val="22"/>
+              </w:rPr>
+              <w:t>Information Service Quality Value for</w:t>
+            </w:r>
+            <w:r>
+              <w:rPr>
+                <w:rFonts w:asciiTheme="minorHAnsi" w:hAnsiTheme="minorHAnsi" w:cstheme="minorHAnsi"/>
+                <w:sz w:val="22"/>
+                <w:szCs w:val="22"/>
+              </w:rPr>
+              <w:t xml:space="preserve"> the exchange</w:t>
             </w:r>
           </w:p>
         </w:tc>
@@ -6144,15 +5856,7 @@
           <w:sz w:val="22"/>
           <w:szCs w:val="22"/>
         </w:rPr>
-        <w:t>Application Providers</w:t>
-      </w:r>
-      <w:r>
-        <w:rPr>
-          <w:rFonts w:asciiTheme="minorHAnsi" w:hAnsiTheme="minorHAnsi" w:cstheme="minorHAnsi"/>
-          <w:sz w:val="22"/>
-          <w:szCs w:val="22"/>
-        </w:rPr>
-        <w:t xml:space="preserve"> and </w:t>
+        <w:t xml:space="preserve">Application Providers and </w:t>
       </w:r>
       <w:r>
         <w:rPr>
@@ -6357,6 +6061,7 @@
                 <w:sz w:val="22"/>
                 <w:szCs w:val="22"/>
               </w:rPr>
+              <w:lastRenderedPageBreak/>
               <w:t>Information Exchanged</w:t>
             </w:r>
           </w:p>
@@ -6707,7 +6412,7 @@
                 <w:sz w:val="22"/>
                 <w:szCs w:val="22"/>
               </w:rPr>
-              <w:t>Frequency</w:t>
+              <w:t>Information Service Quality Value</w:t>
             </w:r>
           </w:p>
         </w:tc>
@@ -6729,7 +6434,23 @@
                 <w:sz w:val="22"/>
                 <w:szCs w:val="22"/>
               </w:rPr>
-              <w:t>Select the frequency of for the exchange</w:t>
+              <w:t xml:space="preserve">Select the </w:t>
+            </w:r>
+            <w:r>
+              <w:rPr>
+                <w:rFonts w:asciiTheme="minorHAnsi" w:hAnsiTheme="minorHAnsi" w:cstheme="minorHAnsi"/>
+                <w:sz w:val="22"/>
+                <w:szCs w:val="22"/>
+              </w:rPr>
+              <w:t>Information Service Quality Value for</w:t>
+            </w:r>
+            <w:r>
+              <w:rPr>
+                <w:rFonts w:asciiTheme="minorHAnsi" w:hAnsiTheme="minorHAnsi" w:cstheme="minorHAnsi"/>
+                <w:sz w:val="22"/>
+                <w:szCs w:val="22"/>
+              </w:rPr>
+              <w:t xml:space="preserve"> the exchange</w:t>
             </w:r>
           </w:p>
         </w:tc>
@@ -6781,7 +6502,6 @@
           <w:sz w:val="22"/>
           <w:szCs w:val="22"/>
         </w:rPr>
-        <w:lastRenderedPageBreak/>
         <w:t>App Interface Dependencies A</w:t>
       </w:r>
       <w:r>
@@ -7382,7 +7102,7 @@
                 <w:sz w:val="22"/>
                 <w:szCs w:val="22"/>
               </w:rPr>
-              <w:t>Frequency</w:t>
+              <w:t>Information Service Quality Value</w:t>
             </w:r>
           </w:p>
         </w:tc>
@@ -7404,7 +7124,23 @@
                 <w:sz w:val="22"/>
                 <w:szCs w:val="22"/>
               </w:rPr>
-              <w:t>Select the frequency of for the exchange</w:t>
+              <w:t xml:space="preserve">Select the </w:t>
+            </w:r>
+            <w:r>
+              <w:rPr>
+                <w:rFonts w:asciiTheme="minorHAnsi" w:hAnsiTheme="minorHAnsi" w:cstheme="minorHAnsi"/>
+                <w:sz w:val="22"/>
+                <w:szCs w:val="22"/>
+              </w:rPr>
+              <w:t>Information Service Quality Value for</w:t>
+            </w:r>
+            <w:r>
+              <w:rPr>
+                <w:rFonts w:asciiTheme="minorHAnsi" w:hAnsiTheme="minorHAnsi" w:cstheme="minorHAnsi"/>
+                <w:sz w:val="22"/>
+                <w:szCs w:val="22"/>
+              </w:rPr>
+              <w:t xml:space="preserve"> the exchange</w:t>
             </w:r>
           </w:p>
         </w:tc>
@@ -7457,7 +7193,7 @@
 </file>
 
 <file path=word/endnotes.xml><?xml version="1.0" encoding="utf-8"?>
-<w:endnotes xmlns:wpc="http://schemas.microsoft.com/office/word/2010/wordprocessingCanvas" xmlns:cx="http://schemas.microsoft.com/office/drawing/2014/chartex" xmlns:cx1="http://schemas.microsoft.com/office/drawing/2015/9/8/chartex" xmlns:cx2="http://schemas.microsoft.com/office/drawing/2015/10/21/chartex" xmlns:cx3="http://schemas.microsoft.com/office/drawing/2016/5/9/chartex" xmlns:cx4="http://schemas.microsoft.com/office/drawing/2016/5/10/chartex" xmlns:cx5="http://schemas.microsoft.com/office/drawing/2016/5/11/chartex" xmlns:cx6="http://schemas.microsoft.com/office/drawing/2016/5/12/chartex" xmlns:cx7="http://schemas.microsoft.com/office/drawing/2016/5/13/chartex" xmlns:cx8="http://schemas.microsoft.com/office/drawing/2016/5/14/chartex" xmlns:mc="http://schemas.openxmlformats.org/markup-compatibility/2006" xmlns:aink="http://schemas.microsoft.com/office/drawing/2016/ink" xmlns:am3d="http://schemas.microsoft.com/office/drawing/2017/model3d" xmlns:o="urn:schemas-microsoft-com:office:office" xmlns:oel="http://schemas.microsoft.com/office/2019/extlst" xmlns:r="http://schemas.openxmlformats.org/officeDocument/2006/relationships" xmlns:m="http://schemas.openxmlformats.org/officeDocument/2006/math" xmlns:v="urn:schemas-microsoft-com:vml" xmlns:wp14="http://schemas.microsoft.com/office/word/2010/wordprocessingDrawing" xmlns:wp="http://schemas.openxmlformats.org/drawingml/2006/wordprocessingDrawing" xmlns:w10="urn:schemas-microsoft-com:office:word" xmlns:w="http://schemas.openxmlformats.org/wordprocessingml/2006/main" xmlns:w14="http://schemas.microsoft.com/office/word/2010/wordml" xmlns:w15="http://schemas.microsoft.com/office/word/2012/wordml" xmlns:w16cex="http://schemas.microsoft.com/office/word/2018/wordml/cex" xmlns:w16cid="http://schemas.microsoft.com/office/word/2016/wordml/cid" xmlns:w16="http://schemas.microsoft.com/office/word/2018/wordml" xmlns:w16sdtdh="http://schemas.microsoft.com/office/word/2020/wordml/sdtdatahash" xmlns:w16se="http://schemas.microsoft.com/office/word/2015/wordml/symex" xmlns:wpg="http://schemas.microsoft.com/office/word/2010/wordprocessingGroup" xmlns:wpi="http://schemas.microsoft.com/office/word/2010/wordprocessingInk" xmlns:wne="http://schemas.microsoft.com/office/word/2006/wordml" xmlns:wps="http://schemas.microsoft.com/office/word/2010/wordprocessingShape" mc:Ignorable="w14 w15 w16se w16cid w16 w16cex w16sdtdh wp14">
+<w:endnotes xmlns:wpc="http://schemas.microsoft.com/office/word/2010/wordprocessingCanvas" xmlns:cx="http://schemas.microsoft.com/office/drawing/2014/chartex" xmlns:cx1="http://schemas.microsoft.com/office/drawing/2015/9/8/chartex" xmlns:cx2="http://schemas.microsoft.com/office/drawing/2015/10/21/chartex" xmlns:cx3="http://schemas.microsoft.com/office/drawing/2016/5/9/chartex" xmlns:cx4="http://schemas.microsoft.com/office/drawing/2016/5/10/chartex" xmlns:cx5="http://schemas.microsoft.com/office/drawing/2016/5/11/chartex" xmlns:cx6="http://schemas.microsoft.com/office/drawing/2016/5/12/chartex" xmlns:cx7="http://schemas.microsoft.com/office/drawing/2016/5/13/chartex" xmlns:cx8="http://schemas.microsoft.com/office/drawing/2016/5/14/chartex" xmlns:mc="http://schemas.openxmlformats.org/markup-compatibility/2006" xmlns:aink="http://schemas.microsoft.com/office/drawing/2016/ink" xmlns:am3d="http://schemas.microsoft.com/office/drawing/2017/model3d" xmlns:o="urn:schemas-microsoft-com:office:office" xmlns:oel="http://schemas.microsoft.com/office/2019/extlst" xmlns:r="http://schemas.openxmlformats.org/officeDocument/2006/relationships" xmlns:m="http://schemas.openxmlformats.org/officeDocument/2006/math" xmlns:v="urn:schemas-microsoft-com:vml" xmlns:wp14="http://schemas.microsoft.com/office/word/2010/wordprocessingDrawing" xmlns:wp="http://schemas.openxmlformats.org/drawingml/2006/wordprocessingDrawing" xmlns:w10="urn:schemas-microsoft-com:office:word" xmlns:w="http://schemas.openxmlformats.org/wordprocessingml/2006/main" xmlns:w14="http://schemas.microsoft.com/office/word/2010/wordml" xmlns:w15="http://schemas.microsoft.com/office/word/2012/wordml" xmlns:w16cex="http://schemas.microsoft.com/office/word/2018/wordml/cex" xmlns:w16cid="http://schemas.microsoft.com/office/word/2016/wordml/cid" xmlns:w16="http://schemas.microsoft.com/office/word/2018/wordml" xmlns:w16du="http://schemas.microsoft.com/office/word/2023/wordml/word16du" xmlns:w16sdtdh="http://schemas.microsoft.com/office/word/2020/wordml/sdtdatahash" xmlns:w16sdtfl="http://schemas.microsoft.com/office/word/2024/wordml/sdtformatlock" xmlns:w16se="http://schemas.microsoft.com/office/word/2015/wordml/symex" xmlns:wpg="http://schemas.microsoft.com/office/word/2010/wordprocessingGroup" xmlns:wpi="http://schemas.microsoft.com/office/word/2010/wordprocessingInk" xmlns:wne="http://schemas.microsoft.com/office/word/2006/wordml" xmlns:wps="http://schemas.microsoft.com/office/word/2010/wordprocessingShape" mc:Ignorable="w14 w15 w16se w16cid w16 w16cex w16sdtdh w16sdtfl w16du wp14">
   <w:endnote w:type="separator" w:id="-1">
     <w:p>
       <w:r>
@@ -7479,7 +7215,7 @@
 </file>
 
 <file path=word/footer1.xml><?xml version="1.0" encoding="utf-8"?>
-<w:ftr xmlns:wpc="http://schemas.microsoft.com/office/word/2010/wordprocessingCanvas" xmlns:cx="http://schemas.microsoft.com/office/drawing/2014/chartex" xmlns:cx1="http://schemas.microsoft.com/office/drawing/2015/9/8/chartex" xmlns:cx2="http://schemas.microsoft.com/office/drawing/2015/10/21/chartex" xmlns:cx3="http://schemas.microsoft.com/office/drawing/2016/5/9/chartex" xmlns:cx4="http://schemas.microsoft.com/office/drawing/2016/5/10/chartex" xmlns:cx5="http://schemas.microsoft.com/office/drawing/2016/5/11/chartex" xmlns:cx6="http://schemas.microsoft.com/office/drawing/2016/5/12/chartex" xmlns:cx7="http://schemas.microsoft.com/office/drawing/2016/5/13/chartex" xmlns:cx8="http://schemas.microsoft.com/office/drawing/2016/5/14/chartex" xmlns:mc="http://schemas.openxmlformats.org/markup-compatibility/2006" xmlns:aink="http://schemas.microsoft.com/office/drawing/2016/ink" xmlns:am3d="http://schemas.microsoft.com/office/drawing/2017/model3d" xmlns:o="urn:schemas-microsoft-com:office:office" xmlns:oel="http://schemas.microsoft.com/office/2019/extlst" xmlns:r="http://schemas.openxmlformats.org/officeDocument/2006/relationships" xmlns:m="http://schemas.openxmlformats.org/officeDocument/2006/math" xmlns:v="urn:schemas-microsoft-com:vml" xmlns:wp14="http://schemas.microsoft.com/office/word/2010/wordprocessingDrawing" xmlns:wp="http://schemas.openxmlformats.org/drawingml/2006/wordprocessingDrawing" xmlns:w10="urn:schemas-microsoft-com:office:word" xmlns:w="http://schemas.openxmlformats.org/wordprocessingml/2006/main" xmlns:w14="http://schemas.microsoft.com/office/word/2010/wordml" xmlns:w15="http://schemas.microsoft.com/office/word/2012/wordml" xmlns:w16cex="http://schemas.microsoft.com/office/word/2018/wordml/cex" xmlns:w16cid="http://schemas.microsoft.com/office/word/2016/wordml/cid" xmlns:w16="http://schemas.microsoft.com/office/word/2018/wordml" xmlns:w16sdtdh="http://schemas.microsoft.com/office/word/2020/wordml/sdtdatahash" xmlns:w16se="http://schemas.microsoft.com/office/word/2015/wordml/symex" xmlns:wpg="http://schemas.microsoft.com/office/word/2010/wordprocessingGroup" xmlns:wpi="http://schemas.microsoft.com/office/word/2010/wordprocessingInk" xmlns:wne="http://schemas.microsoft.com/office/word/2006/wordml" xmlns:wps="http://schemas.microsoft.com/office/word/2010/wordprocessingShape" mc:Ignorable="w14 w15 w16se w16cid w16 w16cex w16sdtdh wp14">
+<w:ftr xmlns:wpc="http://schemas.microsoft.com/office/word/2010/wordprocessingCanvas" xmlns:cx="http://schemas.microsoft.com/office/drawing/2014/chartex" xmlns:cx1="http://schemas.microsoft.com/office/drawing/2015/9/8/chartex" xmlns:cx2="http://schemas.microsoft.com/office/drawing/2015/10/21/chartex" xmlns:cx3="http://schemas.microsoft.com/office/drawing/2016/5/9/chartex" xmlns:cx4="http://schemas.microsoft.com/office/drawing/2016/5/10/chartex" xmlns:cx5="http://schemas.microsoft.com/office/drawing/2016/5/11/chartex" xmlns:cx6="http://schemas.microsoft.com/office/drawing/2016/5/12/chartex" xmlns:cx7="http://schemas.microsoft.com/office/drawing/2016/5/13/chartex" xmlns:cx8="http://schemas.microsoft.com/office/drawing/2016/5/14/chartex" xmlns:mc="http://schemas.openxmlformats.org/markup-compatibility/2006" xmlns:aink="http://schemas.microsoft.com/office/drawing/2016/ink" xmlns:am3d="http://schemas.microsoft.com/office/drawing/2017/model3d" xmlns:o="urn:schemas-microsoft-com:office:office" xmlns:oel="http://schemas.microsoft.com/office/2019/extlst" xmlns:r="http://schemas.openxmlformats.org/officeDocument/2006/relationships" xmlns:m="http://schemas.openxmlformats.org/officeDocument/2006/math" xmlns:v="urn:schemas-microsoft-com:vml" xmlns:wp14="http://schemas.microsoft.com/office/word/2010/wordprocessingDrawing" xmlns:wp="http://schemas.openxmlformats.org/drawingml/2006/wordprocessingDrawing" xmlns:w10="urn:schemas-microsoft-com:office:word" xmlns:w="http://schemas.openxmlformats.org/wordprocessingml/2006/main" xmlns:w14="http://schemas.microsoft.com/office/word/2010/wordml" xmlns:w15="http://schemas.microsoft.com/office/word/2012/wordml" xmlns:w16cex="http://schemas.microsoft.com/office/word/2018/wordml/cex" xmlns:w16cid="http://schemas.microsoft.com/office/word/2016/wordml/cid" xmlns:w16="http://schemas.microsoft.com/office/word/2018/wordml" xmlns:w16du="http://schemas.microsoft.com/office/word/2023/wordml/word16du" xmlns:w16sdtdh="http://schemas.microsoft.com/office/word/2020/wordml/sdtdatahash" xmlns:w16sdtfl="http://schemas.microsoft.com/office/word/2024/wordml/sdtformatlock" xmlns:w16se="http://schemas.microsoft.com/office/word/2015/wordml/symex" xmlns:wpg="http://schemas.microsoft.com/office/word/2010/wordprocessingGroup" xmlns:wpi="http://schemas.microsoft.com/office/word/2010/wordprocessingInk" xmlns:wne="http://schemas.microsoft.com/office/word/2006/wordml" xmlns:wps="http://schemas.microsoft.com/office/word/2010/wordprocessingShape" mc:Ignorable="w14 w15 w16se w16cid w16 w16cex w16sdtdh w16sdtfl w16du wp14">
   <w:sdt>
     <w:sdtPr>
       <w:rPr>
@@ -7531,7 +7267,7 @@
 </file>
 
 <file path=word/footer2.xml><?xml version="1.0" encoding="utf-8"?>
-<w:ftr xmlns:wpc="http://schemas.microsoft.com/office/word/2010/wordprocessingCanvas" xmlns:cx="http://schemas.microsoft.com/office/drawing/2014/chartex" xmlns:cx1="http://schemas.microsoft.com/office/drawing/2015/9/8/chartex" xmlns:cx2="http://schemas.microsoft.com/office/drawing/2015/10/21/chartex" xmlns:cx3="http://schemas.microsoft.com/office/drawing/2016/5/9/chartex" xmlns:cx4="http://schemas.microsoft.com/office/drawing/2016/5/10/chartex" xmlns:cx5="http://schemas.microsoft.com/office/drawing/2016/5/11/chartex" xmlns:cx6="http://schemas.microsoft.com/office/drawing/2016/5/12/chartex" xmlns:cx7="http://schemas.microsoft.com/office/drawing/2016/5/13/chartex" xmlns:cx8="http://schemas.microsoft.com/office/drawing/2016/5/14/chartex" xmlns:mc="http://schemas.openxmlformats.org/markup-compatibility/2006" xmlns:aink="http://schemas.microsoft.com/office/drawing/2016/ink" xmlns:am3d="http://schemas.microsoft.com/office/drawing/2017/model3d" xmlns:o="urn:schemas-microsoft-com:office:office" xmlns:oel="http://schemas.microsoft.com/office/2019/extlst" xmlns:r="http://schemas.openxmlformats.org/officeDocument/2006/relationships" xmlns:m="http://schemas.openxmlformats.org/officeDocument/2006/math" xmlns:v="urn:schemas-microsoft-com:vml" xmlns:wp14="http://schemas.microsoft.com/office/word/2010/wordprocessingDrawing" xmlns:wp="http://schemas.openxmlformats.org/drawingml/2006/wordprocessingDrawing" xmlns:w10="urn:schemas-microsoft-com:office:word" xmlns:w="http://schemas.openxmlformats.org/wordprocessingml/2006/main" xmlns:w14="http://schemas.microsoft.com/office/word/2010/wordml" xmlns:w15="http://schemas.microsoft.com/office/word/2012/wordml" xmlns:w16cex="http://schemas.microsoft.com/office/word/2018/wordml/cex" xmlns:w16cid="http://schemas.microsoft.com/office/word/2016/wordml/cid" xmlns:w16="http://schemas.microsoft.com/office/word/2018/wordml" xmlns:w16sdtdh="http://schemas.microsoft.com/office/word/2020/wordml/sdtdatahash" xmlns:w16se="http://schemas.microsoft.com/office/word/2015/wordml/symex" xmlns:wpg="http://schemas.microsoft.com/office/word/2010/wordprocessingGroup" xmlns:wpi="http://schemas.microsoft.com/office/word/2010/wordprocessingInk" xmlns:wne="http://schemas.microsoft.com/office/word/2006/wordml" xmlns:wps="http://schemas.microsoft.com/office/word/2010/wordprocessingShape" mc:Ignorable="w14 w15 w16se w16cid w16 w16cex w16sdtdh wp14">
+<w:ftr xmlns:wpc="http://schemas.microsoft.com/office/word/2010/wordprocessingCanvas" xmlns:cx="http://schemas.microsoft.com/office/drawing/2014/chartex" xmlns:cx1="http://schemas.microsoft.com/office/drawing/2015/9/8/chartex" xmlns:cx2="http://schemas.microsoft.com/office/drawing/2015/10/21/chartex" xmlns:cx3="http://schemas.microsoft.com/office/drawing/2016/5/9/chartex" xmlns:cx4="http://schemas.microsoft.com/office/drawing/2016/5/10/chartex" xmlns:cx5="http://schemas.microsoft.com/office/drawing/2016/5/11/chartex" xmlns:cx6="http://schemas.microsoft.com/office/drawing/2016/5/12/chartex" xmlns:cx7="http://schemas.microsoft.com/office/drawing/2016/5/13/chartex" xmlns:cx8="http://schemas.microsoft.com/office/drawing/2016/5/14/chartex" xmlns:mc="http://schemas.openxmlformats.org/markup-compatibility/2006" xmlns:aink="http://schemas.microsoft.com/office/drawing/2016/ink" xmlns:am3d="http://schemas.microsoft.com/office/drawing/2017/model3d" xmlns:o="urn:schemas-microsoft-com:office:office" xmlns:oel="http://schemas.microsoft.com/office/2019/extlst" xmlns:r="http://schemas.openxmlformats.org/officeDocument/2006/relationships" xmlns:m="http://schemas.openxmlformats.org/officeDocument/2006/math" xmlns:v="urn:schemas-microsoft-com:vml" xmlns:wp14="http://schemas.microsoft.com/office/word/2010/wordprocessingDrawing" xmlns:wp="http://schemas.openxmlformats.org/drawingml/2006/wordprocessingDrawing" xmlns:w10="urn:schemas-microsoft-com:office:word" xmlns:w="http://schemas.openxmlformats.org/wordprocessingml/2006/main" xmlns:w14="http://schemas.microsoft.com/office/word/2010/wordml" xmlns:w15="http://schemas.microsoft.com/office/word/2012/wordml" xmlns:w16cex="http://schemas.microsoft.com/office/word/2018/wordml/cex" xmlns:w16cid="http://schemas.microsoft.com/office/word/2016/wordml/cid" xmlns:w16="http://schemas.microsoft.com/office/word/2018/wordml" xmlns:w16du="http://schemas.microsoft.com/office/word/2023/wordml/word16du" xmlns:w16sdtdh="http://schemas.microsoft.com/office/word/2020/wordml/sdtdatahash" xmlns:w16sdtfl="http://schemas.microsoft.com/office/word/2024/wordml/sdtformatlock" xmlns:w16se="http://schemas.microsoft.com/office/word/2015/wordml/symex" xmlns:wpg="http://schemas.microsoft.com/office/word/2010/wordprocessingGroup" xmlns:wpi="http://schemas.microsoft.com/office/word/2010/wordprocessingInk" xmlns:wne="http://schemas.microsoft.com/office/word/2006/wordml" xmlns:wps="http://schemas.microsoft.com/office/word/2010/wordprocessingShape" mc:Ignorable="w14 w15 w16se w16cid w16 w16cex w16sdtdh w16sdtfl w16du wp14">
   <w:sdt>
     <w:sdtPr>
       <w:rPr>
@@ -7672,7 +7408,7 @@
 </file>
 
 <file path=word/footer3.xml><?xml version="1.0" encoding="utf-8"?>
-<w:ftr xmlns:wpc="http://schemas.microsoft.com/office/word/2010/wordprocessingCanvas" xmlns:cx="http://schemas.microsoft.com/office/drawing/2014/chartex" xmlns:cx1="http://schemas.microsoft.com/office/drawing/2015/9/8/chartex" xmlns:cx2="http://schemas.microsoft.com/office/drawing/2015/10/21/chartex" xmlns:cx3="http://schemas.microsoft.com/office/drawing/2016/5/9/chartex" xmlns:cx4="http://schemas.microsoft.com/office/drawing/2016/5/10/chartex" xmlns:cx5="http://schemas.microsoft.com/office/drawing/2016/5/11/chartex" xmlns:cx6="http://schemas.microsoft.com/office/drawing/2016/5/12/chartex" xmlns:cx7="http://schemas.microsoft.com/office/drawing/2016/5/13/chartex" xmlns:cx8="http://schemas.microsoft.com/office/drawing/2016/5/14/chartex" xmlns:mc="http://schemas.openxmlformats.org/markup-compatibility/2006" xmlns:aink="http://schemas.microsoft.com/office/drawing/2016/ink" xmlns:am3d="http://schemas.microsoft.com/office/drawing/2017/model3d" xmlns:o="urn:schemas-microsoft-com:office:office" xmlns:oel="http://schemas.microsoft.com/office/2019/extlst" xmlns:r="http://schemas.openxmlformats.org/officeDocument/2006/relationships" xmlns:m="http://schemas.openxmlformats.org/officeDocument/2006/math" xmlns:v="urn:schemas-microsoft-com:vml" xmlns:wp14="http://schemas.microsoft.com/office/word/2010/wordprocessingDrawing" xmlns:wp="http://schemas.openxmlformats.org/drawingml/2006/wordprocessingDrawing" xmlns:w10="urn:schemas-microsoft-com:office:word" xmlns:w="http://schemas.openxmlformats.org/wordprocessingml/2006/main" xmlns:w14="http://schemas.microsoft.com/office/word/2010/wordml" xmlns:w15="http://schemas.microsoft.com/office/word/2012/wordml" xmlns:w16cex="http://schemas.microsoft.com/office/word/2018/wordml/cex" xmlns:w16cid="http://schemas.microsoft.com/office/word/2016/wordml/cid" xmlns:w16="http://schemas.microsoft.com/office/word/2018/wordml" xmlns:w16sdtdh="http://schemas.microsoft.com/office/word/2020/wordml/sdtdatahash" xmlns:w16se="http://schemas.microsoft.com/office/word/2015/wordml/symex" xmlns:wpg="http://schemas.microsoft.com/office/word/2010/wordprocessingGroup" xmlns:wpi="http://schemas.microsoft.com/office/word/2010/wordprocessingInk" xmlns:wne="http://schemas.microsoft.com/office/word/2006/wordml" xmlns:wps="http://schemas.microsoft.com/office/word/2010/wordprocessingShape" mc:Ignorable="w14 w15 w16se w16cid w16 w16cex w16sdtdh wp14">
+<w:ftr xmlns:wpc="http://schemas.microsoft.com/office/word/2010/wordprocessingCanvas" xmlns:cx="http://schemas.microsoft.com/office/drawing/2014/chartex" xmlns:cx1="http://schemas.microsoft.com/office/drawing/2015/9/8/chartex" xmlns:cx2="http://schemas.microsoft.com/office/drawing/2015/10/21/chartex" xmlns:cx3="http://schemas.microsoft.com/office/drawing/2016/5/9/chartex" xmlns:cx4="http://schemas.microsoft.com/office/drawing/2016/5/10/chartex" xmlns:cx5="http://schemas.microsoft.com/office/drawing/2016/5/11/chartex" xmlns:cx6="http://schemas.microsoft.com/office/drawing/2016/5/12/chartex" xmlns:cx7="http://schemas.microsoft.com/office/drawing/2016/5/13/chartex" xmlns:cx8="http://schemas.microsoft.com/office/drawing/2016/5/14/chartex" xmlns:mc="http://schemas.openxmlformats.org/markup-compatibility/2006" xmlns:aink="http://schemas.microsoft.com/office/drawing/2016/ink" xmlns:am3d="http://schemas.microsoft.com/office/drawing/2017/model3d" xmlns:o="urn:schemas-microsoft-com:office:office" xmlns:oel="http://schemas.microsoft.com/office/2019/extlst" xmlns:r="http://schemas.openxmlformats.org/officeDocument/2006/relationships" xmlns:m="http://schemas.openxmlformats.org/officeDocument/2006/math" xmlns:v="urn:schemas-microsoft-com:vml" xmlns:wp14="http://schemas.microsoft.com/office/word/2010/wordprocessingDrawing" xmlns:wp="http://schemas.openxmlformats.org/drawingml/2006/wordprocessingDrawing" xmlns:w10="urn:schemas-microsoft-com:office:word" xmlns:w="http://schemas.openxmlformats.org/wordprocessingml/2006/main" xmlns:w14="http://schemas.microsoft.com/office/word/2010/wordml" xmlns:w15="http://schemas.microsoft.com/office/word/2012/wordml" xmlns:w16cex="http://schemas.microsoft.com/office/word/2018/wordml/cex" xmlns:w16cid="http://schemas.microsoft.com/office/word/2016/wordml/cid" xmlns:w16="http://schemas.microsoft.com/office/word/2018/wordml" xmlns:w16du="http://schemas.microsoft.com/office/word/2023/wordml/word16du" xmlns:w16sdtdh="http://schemas.microsoft.com/office/word/2020/wordml/sdtdatahash" xmlns:w16sdtfl="http://schemas.microsoft.com/office/word/2024/wordml/sdtformatlock" xmlns:w16se="http://schemas.microsoft.com/office/word/2015/wordml/symex" xmlns:wpg="http://schemas.microsoft.com/office/word/2010/wordprocessingGroup" xmlns:wpi="http://schemas.microsoft.com/office/word/2010/wordprocessingInk" xmlns:wne="http://schemas.microsoft.com/office/word/2006/wordml" xmlns:wps="http://schemas.microsoft.com/office/word/2010/wordprocessingShape" mc:Ignorable="w14 w15 w16se w16cid w16 w16cex w16sdtdh w16sdtfl w16du wp14">
   <w:p>
     <w:pPr>
       <w:pStyle w:val="Footer"/>
@@ -7682,7 +7418,7 @@
 </file>
 
 <file path=word/footnotes.xml><?xml version="1.0" encoding="utf-8"?>
-<w:footnotes xmlns:wpc="http://schemas.microsoft.com/office/word/2010/wordprocessingCanvas" xmlns:cx="http://schemas.microsoft.com/office/drawing/2014/chartex" xmlns:cx1="http://schemas.microsoft.com/office/drawing/2015/9/8/chartex" xmlns:cx2="http://schemas.microsoft.com/office/drawing/2015/10/21/chartex" xmlns:cx3="http://schemas.microsoft.com/office/drawing/2016/5/9/chartex" xmlns:cx4="http://schemas.microsoft.com/office/drawing/2016/5/10/chartex" xmlns:cx5="http://schemas.microsoft.com/office/drawing/2016/5/11/chartex" xmlns:cx6="http://schemas.microsoft.com/office/drawing/2016/5/12/chartex" xmlns:cx7="http://schemas.microsoft.com/office/drawing/2016/5/13/chartex" xmlns:cx8="http://schemas.microsoft.com/office/drawing/2016/5/14/chartex" xmlns:mc="http://schemas.openxmlformats.org/markup-compatibility/2006" xmlns:aink="http://schemas.microsoft.com/office/drawing/2016/ink" xmlns:am3d="http://schemas.microsoft.com/office/drawing/2017/model3d" xmlns:o="urn:schemas-microsoft-com:office:office" xmlns:oel="http://schemas.microsoft.com/office/2019/extlst" xmlns:r="http://schemas.openxmlformats.org/officeDocument/2006/relationships" xmlns:m="http://schemas.openxmlformats.org/officeDocument/2006/math" xmlns:v="urn:schemas-microsoft-com:vml" xmlns:wp14="http://schemas.microsoft.com/office/word/2010/wordprocessingDrawing" xmlns:wp="http://schemas.openxmlformats.org/drawingml/2006/wordprocessingDrawing" xmlns:w10="urn:schemas-microsoft-com:office:word" xmlns:w="http://schemas.openxmlformats.org/wordprocessingml/2006/main" xmlns:w14="http://schemas.microsoft.com/office/word/2010/wordml" xmlns:w15="http://schemas.microsoft.com/office/word/2012/wordml" xmlns:w16cex="http://schemas.microsoft.com/office/word/2018/wordml/cex" xmlns:w16cid="http://schemas.microsoft.com/office/word/2016/wordml/cid" xmlns:w16="http://schemas.microsoft.com/office/word/2018/wordml" xmlns:w16sdtdh="http://schemas.microsoft.com/office/word/2020/wordml/sdtdatahash" xmlns:w16se="http://schemas.microsoft.com/office/word/2015/wordml/symex" xmlns:wpg="http://schemas.microsoft.com/office/word/2010/wordprocessingGroup" xmlns:wpi="http://schemas.microsoft.com/office/word/2010/wordprocessingInk" xmlns:wne="http://schemas.microsoft.com/office/word/2006/wordml" xmlns:wps="http://schemas.microsoft.com/office/word/2010/wordprocessingShape" mc:Ignorable="w14 w15 w16se w16cid w16 w16cex w16sdtdh wp14">
+<w:footnotes xmlns:wpc="http://schemas.microsoft.com/office/word/2010/wordprocessingCanvas" xmlns:cx="http://schemas.microsoft.com/office/drawing/2014/chartex" xmlns:cx1="http://schemas.microsoft.com/office/drawing/2015/9/8/chartex" xmlns:cx2="http://schemas.microsoft.com/office/drawing/2015/10/21/chartex" xmlns:cx3="http://schemas.microsoft.com/office/drawing/2016/5/9/chartex" xmlns:cx4="http://schemas.microsoft.com/office/drawing/2016/5/10/chartex" xmlns:cx5="http://schemas.microsoft.com/office/drawing/2016/5/11/chartex" xmlns:cx6="http://schemas.microsoft.com/office/drawing/2016/5/12/chartex" xmlns:cx7="http://schemas.microsoft.com/office/drawing/2016/5/13/chartex" xmlns:cx8="http://schemas.microsoft.com/office/drawing/2016/5/14/chartex" xmlns:mc="http://schemas.openxmlformats.org/markup-compatibility/2006" xmlns:aink="http://schemas.microsoft.com/office/drawing/2016/ink" xmlns:am3d="http://schemas.microsoft.com/office/drawing/2017/model3d" xmlns:o="urn:schemas-microsoft-com:office:office" xmlns:oel="http://schemas.microsoft.com/office/2019/extlst" xmlns:r="http://schemas.openxmlformats.org/officeDocument/2006/relationships" xmlns:m="http://schemas.openxmlformats.org/officeDocument/2006/math" xmlns:v="urn:schemas-microsoft-com:vml" xmlns:wp14="http://schemas.microsoft.com/office/word/2010/wordprocessingDrawing" xmlns:wp="http://schemas.openxmlformats.org/drawingml/2006/wordprocessingDrawing" xmlns:w10="urn:schemas-microsoft-com:office:word" xmlns:w="http://schemas.openxmlformats.org/wordprocessingml/2006/main" xmlns:w14="http://schemas.microsoft.com/office/word/2010/wordml" xmlns:w15="http://schemas.microsoft.com/office/word/2012/wordml" xmlns:w16cex="http://schemas.microsoft.com/office/word/2018/wordml/cex" xmlns:w16cid="http://schemas.microsoft.com/office/word/2016/wordml/cid" xmlns:w16="http://schemas.microsoft.com/office/word/2018/wordml" xmlns:w16du="http://schemas.microsoft.com/office/word/2023/wordml/word16du" xmlns:w16sdtdh="http://schemas.microsoft.com/office/word/2020/wordml/sdtdatahash" xmlns:w16sdtfl="http://schemas.microsoft.com/office/word/2024/wordml/sdtformatlock" xmlns:w16se="http://schemas.microsoft.com/office/word/2015/wordml/symex" xmlns:wpg="http://schemas.microsoft.com/office/word/2010/wordprocessingGroup" xmlns:wpi="http://schemas.microsoft.com/office/word/2010/wordprocessingInk" xmlns:wne="http://schemas.microsoft.com/office/word/2006/wordml" xmlns:wps="http://schemas.microsoft.com/office/word/2010/wordprocessingShape" mc:Ignorable="w14 w15 w16se w16cid w16 w16cex w16sdtdh w16sdtfl w16du wp14">
   <w:footnote w:type="separator" w:id="-1">
     <w:p>
       <w:r>
@@ -7704,7 +7440,7 @@
 </file>
 
 <file path=word/header1.xml><?xml version="1.0" encoding="utf-8"?>
-<w:hdr xmlns:wpc="http://schemas.microsoft.com/office/word/2010/wordprocessingCanvas" xmlns:cx="http://schemas.microsoft.com/office/drawing/2014/chartex" xmlns:cx1="http://schemas.microsoft.com/office/drawing/2015/9/8/chartex" xmlns:cx2="http://schemas.microsoft.com/office/drawing/2015/10/21/chartex" xmlns:cx3="http://schemas.microsoft.com/office/drawing/2016/5/9/chartex" xmlns:cx4="http://schemas.microsoft.com/office/drawing/2016/5/10/chartex" xmlns:cx5="http://schemas.microsoft.com/office/drawing/2016/5/11/chartex" xmlns:cx6="http://schemas.microsoft.com/office/drawing/2016/5/12/chartex" xmlns:cx7="http://schemas.microsoft.com/office/drawing/2016/5/13/chartex" xmlns:cx8="http://schemas.microsoft.com/office/drawing/2016/5/14/chartex" xmlns:mc="http://schemas.openxmlformats.org/markup-compatibility/2006" xmlns:aink="http://schemas.microsoft.com/office/drawing/2016/ink" xmlns:am3d="http://schemas.microsoft.com/office/drawing/2017/model3d" xmlns:o="urn:schemas-microsoft-com:office:office" xmlns:oel="http://schemas.microsoft.com/office/2019/extlst" xmlns:r="http://schemas.openxmlformats.org/officeDocument/2006/relationships" xmlns:m="http://schemas.openxmlformats.org/officeDocument/2006/math" xmlns:v="urn:schemas-microsoft-com:vml" xmlns:wp14="http://schemas.microsoft.com/office/word/2010/wordprocessingDrawing" xmlns:wp="http://schemas.openxmlformats.org/drawingml/2006/wordprocessingDrawing" xmlns:w10="urn:schemas-microsoft-com:office:word" xmlns:w="http://schemas.openxmlformats.org/wordprocessingml/2006/main" xmlns:w14="http://schemas.microsoft.com/office/word/2010/wordml" xmlns:w15="http://schemas.microsoft.com/office/word/2012/wordml" xmlns:w16cex="http://schemas.microsoft.com/office/word/2018/wordml/cex" xmlns:w16cid="http://schemas.microsoft.com/office/word/2016/wordml/cid" xmlns:w16="http://schemas.microsoft.com/office/word/2018/wordml" xmlns:w16sdtdh="http://schemas.microsoft.com/office/word/2020/wordml/sdtdatahash" xmlns:w16se="http://schemas.microsoft.com/office/word/2015/wordml/symex" xmlns:wpg="http://schemas.microsoft.com/office/word/2010/wordprocessingGroup" xmlns:wpi="http://schemas.microsoft.com/office/word/2010/wordprocessingInk" xmlns:wne="http://schemas.microsoft.com/office/word/2006/wordml" xmlns:wps="http://schemas.microsoft.com/office/word/2010/wordprocessingShape" mc:Ignorable="w14 w15 w16se w16cid w16 w16cex w16sdtdh wp14">
+<w:hdr xmlns:wpc="http://schemas.microsoft.com/office/word/2010/wordprocessingCanvas" xmlns:cx="http://schemas.microsoft.com/office/drawing/2014/chartex" xmlns:cx1="http://schemas.microsoft.com/office/drawing/2015/9/8/chartex" xmlns:cx2="http://schemas.microsoft.com/office/drawing/2015/10/21/chartex" xmlns:cx3="http://schemas.microsoft.com/office/drawing/2016/5/9/chartex" xmlns:cx4="http://schemas.microsoft.com/office/drawing/2016/5/10/chartex" xmlns:cx5="http://schemas.microsoft.com/office/drawing/2016/5/11/chartex" xmlns:cx6="http://schemas.microsoft.com/office/drawing/2016/5/12/chartex" xmlns:cx7="http://schemas.microsoft.com/office/drawing/2016/5/13/chartex" xmlns:cx8="http://schemas.microsoft.com/office/drawing/2016/5/14/chartex" xmlns:mc="http://schemas.openxmlformats.org/markup-compatibility/2006" xmlns:aink="http://schemas.microsoft.com/office/drawing/2016/ink" xmlns:am3d="http://schemas.microsoft.com/office/drawing/2017/model3d" xmlns:o="urn:schemas-microsoft-com:office:office" xmlns:oel="http://schemas.microsoft.com/office/2019/extlst" xmlns:r="http://schemas.openxmlformats.org/officeDocument/2006/relationships" xmlns:m="http://schemas.openxmlformats.org/officeDocument/2006/math" xmlns:v="urn:schemas-microsoft-com:vml" xmlns:wp14="http://schemas.microsoft.com/office/word/2010/wordprocessingDrawing" xmlns:wp="http://schemas.openxmlformats.org/drawingml/2006/wordprocessingDrawing" xmlns:w10="urn:schemas-microsoft-com:office:word" xmlns:w="http://schemas.openxmlformats.org/wordprocessingml/2006/main" xmlns:w14="http://schemas.microsoft.com/office/word/2010/wordml" xmlns:w15="http://schemas.microsoft.com/office/word/2012/wordml" xmlns:w16cex="http://schemas.microsoft.com/office/word/2018/wordml/cex" xmlns:w16cid="http://schemas.microsoft.com/office/word/2016/wordml/cid" xmlns:w16="http://schemas.microsoft.com/office/word/2018/wordml" xmlns:w16du="http://schemas.microsoft.com/office/word/2023/wordml/word16du" xmlns:w16sdtdh="http://schemas.microsoft.com/office/word/2020/wordml/sdtdatahash" xmlns:w16sdtfl="http://schemas.microsoft.com/office/word/2024/wordml/sdtformatlock" xmlns:w16se="http://schemas.microsoft.com/office/word/2015/wordml/symex" xmlns:wpg="http://schemas.microsoft.com/office/word/2010/wordprocessingGroup" xmlns:wpi="http://schemas.microsoft.com/office/word/2010/wordprocessingInk" xmlns:wne="http://schemas.microsoft.com/office/word/2006/wordml" xmlns:wps="http://schemas.microsoft.com/office/word/2010/wordprocessingShape" mc:Ignorable="w14 w15 w16se w16cid w16 w16cex w16sdtdh w16sdtfl w16du wp14">
   <w:p>
     <w:pPr>
       <w:pStyle w:val="Header"/>
@@ -7714,7 +7450,7 @@
 </file>
 
 <file path=word/header2.xml><?xml version="1.0" encoding="utf-8"?>
-<w:hdr xmlns:wpc="http://schemas.microsoft.com/office/word/2010/wordprocessingCanvas" xmlns:cx="http://schemas.microsoft.com/office/drawing/2014/chartex" xmlns:cx1="http://schemas.microsoft.com/office/drawing/2015/9/8/chartex" xmlns:cx2="http://schemas.microsoft.com/office/drawing/2015/10/21/chartex" xmlns:cx3="http://schemas.microsoft.com/office/drawing/2016/5/9/chartex" xmlns:cx4="http://schemas.microsoft.com/office/drawing/2016/5/10/chartex" xmlns:cx5="http://schemas.microsoft.com/office/drawing/2016/5/11/chartex" xmlns:cx6="http://schemas.microsoft.com/office/drawing/2016/5/12/chartex" xmlns:cx7="http://schemas.microsoft.com/office/drawing/2016/5/13/chartex" xmlns:cx8="http://schemas.microsoft.com/office/drawing/2016/5/14/chartex" xmlns:mc="http://schemas.openxmlformats.org/markup-compatibility/2006" xmlns:aink="http://schemas.microsoft.com/office/drawing/2016/ink" xmlns:am3d="http://schemas.microsoft.com/office/drawing/2017/model3d" xmlns:o="urn:schemas-microsoft-com:office:office" xmlns:oel="http://schemas.microsoft.com/office/2019/extlst" xmlns:r="http://schemas.openxmlformats.org/officeDocument/2006/relationships" xmlns:m="http://schemas.openxmlformats.org/officeDocument/2006/math" xmlns:v="urn:schemas-microsoft-com:vml" xmlns:wp14="http://schemas.microsoft.com/office/word/2010/wordprocessingDrawing" xmlns:wp="http://schemas.openxmlformats.org/drawingml/2006/wordprocessingDrawing" xmlns:w10="urn:schemas-microsoft-com:office:word" xmlns:w="http://schemas.openxmlformats.org/wordprocessingml/2006/main" xmlns:w14="http://schemas.microsoft.com/office/word/2010/wordml" xmlns:w15="http://schemas.microsoft.com/office/word/2012/wordml" xmlns:w16cex="http://schemas.microsoft.com/office/word/2018/wordml/cex" xmlns:w16cid="http://schemas.microsoft.com/office/word/2016/wordml/cid" xmlns:w16="http://schemas.microsoft.com/office/word/2018/wordml" xmlns:w16sdtdh="http://schemas.microsoft.com/office/word/2020/wordml/sdtdatahash" xmlns:w16se="http://schemas.microsoft.com/office/word/2015/wordml/symex" xmlns:wpg="http://schemas.microsoft.com/office/word/2010/wordprocessingGroup" xmlns:wpi="http://schemas.microsoft.com/office/word/2010/wordprocessingInk" xmlns:wne="http://schemas.microsoft.com/office/word/2006/wordml" xmlns:wps="http://schemas.microsoft.com/office/word/2010/wordprocessingShape" mc:Ignorable="w14 w15 w16se w16cid w16 w16cex w16sdtdh wp14">
+<w:hdr xmlns:wpc="http://schemas.microsoft.com/office/word/2010/wordprocessingCanvas" xmlns:cx="http://schemas.microsoft.com/office/drawing/2014/chartex" xmlns:cx1="http://schemas.microsoft.com/office/drawing/2015/9/8/chartex" xmlns:cx2="http://schemas.microsoft.com/office/drawing/2015/10/21/chartex" xmlns:cx3="http://schemas.microsoft.com/office/drawing/2016/5/9/chartex" xmlns:cx4="http://schemas.microsoft.com/office/drawing/2016/5/10/chartex" xmlns:cx5="http://schemas.microsoft.com/office/drawing/2016/5/11/chartex" xmlns:cx6="http://schemas.microsoft.com/office/drawing/2016/5/12/chartex" xmlns:cx7="http://schemas.microsoft.com/office/drawing/2016/5/13/chartex" xmlns:cx8="http://schemas.microsoft.com/office/drawing/2016/5/14/chartex" xmlns:mc="http://schemas.openxmlformats.org/markup-compatibility/2006" xmlns:aink="http://schemas.microsoft.com/office/drawing/2016/ink" xmlns:am3d="http://schemas.microsoft.com/office/drawing/2017/model3d" xmlns:o="urn:schemas-microsoft-com:office:office" xmlns:oel="http://schemas.microsoft.com/office/2019/extlst" xmlns:r="http://schemas.openxmlformats.org/officeDocument/2006/relationships" xmlns:m="http://schemas.openxmlformats.org/officeDocument/2006/math" xmlns:v="urn:schemas-microsoft-com:vml" xmlns:wp14="http://schemas.microsoft.com/office/word/2010/wordprocessingDrawing" xmlns:wp="http://schemas.openxmlformats.org/drawingml/2006/wordprocessingDrawing" xmlns:w10="urn:schemas-microsoft-com:office:word" xmlns:w="http://schemas.openxmlformats.org/wordprocessingml/2006/main" xmlns:w14="http://schemas.microsoft.com/office/word/2010/wordml" xmlns:w15="http://schemas.microsoft.com/office/word/2012/wordml" xmlns:w16cex="http://schemas.microsoft.com/office/word/2018/wordml/cex" xmlns:w16cid="http://schemas.microsoft.com/office/word/2016/wordml/cid" xmlns:w16="http://schemas.microsoft.com/office/word/2018/wordml" xmlns:w16du="http://schemas.microsoft.com/office/word/2023/wordml/word16du" xmlns:w16sdtdh="http://schemas.microsoft.com/office/word/2020/wordml/sdtdatahash" xmlns:w16sdtfl="http://schemas.microsoft.com/office/word/2024/wordml/sdtformatlock" xmlns:w16se="http://schemas.microsoft.com/office/word/2015/wordml/symex" xmlns:wpg="http://schemas.microsoft.com/office/word/2010/wordprocessingGroup" xmlns:wpi="http://schemas.microsoft.com/office/word/2010/wordprocessingInk" xmlns:wne="http://schemas.microsoft.com/office/word/2006/wordml" xmlns:wps="http://schemas.microsoft.com/office/word/2010/wordprocessingShape" mc:Ignorable="w14 w15 w16se w16cid w16 w16cex w16sdtdh w16sdtfl w16du wp14">
   <w:p>
     <w:pPr>
       <w:pStyle w:val="Header"/>
@@ -7724,7 +7460,7 @@
 </file>
 
 <file path=word/header3.xml><?xml version="1.0" encoding="utf-8"?>
-<w:hdr xmlns:wpc="http://schemas.microsoft.com/office/word/2010/wordprocessingCanvas" xmlns:cx="http://schemas.microsoft.com/office/drawing/2014/chartex" xmlns:cx1="http://schemas.microsoft.com/office/drawing/2015/9/8/chartex" xmlns:cx2="http://schemas.microsoft.com/office/drawing/2015/10/21/chartex" xmlns:cx3="http://schemas.microsoft.com/office/drawing/2016/5/9/chartex" xmlns:cx4="http://schemas.microsoft.com/office/drawing/2016/5/10/chartex" xmlns:cx5="http://schemas.microsoft.com/office/drawing/2016/5/11/chartex" xmlns:cx6="http://schemas.microsoft.com/office/drawing/2016/5/12/chartex" xmlns:cx7="http://schemas.microsoft.com/office/drawing/2016/5/13/chartex" xmlns:cx8="http://schemas.microsoft.com/office/drawing/2016/5/14/chartex" xmlns:mc="http://schemas.openxmlformats.org/markup-compatibility/2006" xmlns:aink="http://schemas.microsoft.com/office/drawing/2016/ink" xmlns:am3d="http://schemas.microsoft.com/office/drawing/2017/model3d" xmlns:o="urn:schemas-microsoft-com:office:office" xmlns:oel="http://schemas.microsoft.com/office/2019/extlst" xmlns:r="http://schemas.openxmlformats.org/officeDocument/2006/relationships" xmlns:m="http://schemas.openxmlformats.org/officeDocument/2006/math" xmlns:v="urn:schemas-microsoft-com:vml" xmlns:wp14="http://schemas.microsoft.com/office/word/2010/wordprocessingDrawing" xmlns:wp="http://schemas.openxmlformats.org/drawingml/2006/wordprocessingDrawing" xmlns:w10="urn:schemas-microsoft-com:office:word" xmlns:w="http://schemas.openxmlformats.org/wordprocessingml/2006/main" xmlns:w14="http://schemas.microsoft.com/office/word/2010/wordml" xmlns:w15="http://schemas.microsoft.com/office/word/2012/wordml" xmlns:w16cex="http://schemas.microsoft.com/office/word/2018/wordml/cex" xmlns:w16cid="http://schemas.microsoft.com/office/word/2016/wordml/cid" xmlns:w16="http://schemas.microsoft.com/office/word/2018/wordml" xmlns:w16sdtdh="http://schemas.microsoft.com/office/word/2020/wordml/sdtdatahash" xmlns:w16se="http://schemas.microsoft.com/office/word/2015/wordml/symex" xmlns:wpg="http://schemas.microsoft.com/office/word/2010/wordprocessingGroup" xmlns:wpi="http://schemas.microsoft.com/office/word/2010/wordprocessingInk" xmlns:wne="http://schemas.microsoft.com/office/word/2006/wordml" xmlns:wps="http://schemas.microsoft.com/office/word/2010/wordprocessingShape" mc:Ignorable="w14 w15 w16se w16cid w16 w16cex w16sdtdh wp14">
+<w:hdr xmlns:wpc="http://schemas.microsoft.com/office/word/2010/wordprocessingCanvas" xmlns:cx="http://schemas.microsoft.com/office/drawing/2014/chartex" xmlns:cx1="http://schemas.microsoft.com/office/drawing/2015/9/8/chartex" xmlns:cx2="http://schemas.microsoft.com/office/drawing/2015/10/21/chartex" xmlns:cx3="http://schemas.microsoft.com/office/drawing/2016/5/9/chartex" xmlns:cx4="http://schemas.microsoft.com/office/drawing/2016/5/10/chartex" xmlns:cx5="http://schemas.microsoft.com/office/drawing/2016/5/11/chartex" xmlns:cx6="http://schemas.microsoft.com/office/drawing/2016/5/12/chartex" xmlns:cx7="http://schemas.microsoft.com/office/drawing/2016/5/13/chartex" xmlns:cx8="http://schemas.microsoft.com/office/drawing/2016/5/14/chartex" xmlns:mc="http://schemas.openxmlformats.org/markup-compatibility/2006" xmlns:aink="http://schemas.microsoft.com/office/drawing/2016/ink" xmlns:am3d="http://schemas.microsoft.com/office/drawing/2017/model3d" xmlns:o="urn:schemas-microsoft-com:office:office" xmlns:oel="http://schemas.microsoft.com/office/2019/extlst" xmlns:r="http://schemas.openxmlformats.org/officeDocument/2006/relationships" xmlns:m="http://schemas.openxmlformats.org/officeDocument/2006/math" xmlns:v="urn:schemas-microsoft-com:vml" xmlns:wp14="http://schemas.microsoft.com/office/word/2010/wordprocessingDrawing" xmlns:wp="http://schemas.openxmlformats.org/drawingml/2006/wordprocessingDrawing" xmlns:w10="urn:schemas-microsoft-com:office:word" xmlns:w="http://schemas.openxmlformats.org/wordprocessingml/2006/main" xmlns:w14="http://schemas.microsoft.com/office/word/2010/wordml" xmlns:w15="http://schemas.microsoft.com/office/word/2012/wordml" xmlns:w16cex="http://schemas.microsoft.com/office/word/2018/wordml/cex" xmlns:w16cid="http://schemas.microsoft.com/office/word/2016/wordml/cid" xmlns:w16="http://schemas.microsoft.com/office/word/2018/wordml" xmlns:w16du="http://schemas.microsoft.com/office/word/2023/wordml/word16du" xmlns:w16sdtdh="http://schemas.microsoft.com/office/word/2020/wordml/sdtdatahash" xmlns:w16sdtfl="http://schemas.microsoft.com/office/word/2024/wordml/sdtformatlock" xmlns:w16se="http://schemas.microsoft.com/office/word/2015/wordml/symex" xmlns:wpg="http://schemas.microsoft.com/office/word/2010/wordprocessingGroup" xmlns:wpi="http://schemas.microsoft.com/office/word/2010/wordprocessingInk" xmlns:wne="http://schemas.microsoft.com/office/word/2006/wordml" xmlns:wps="http://schemas.microsoft.com/office/word/2010/wordprocessingShape" mc:Ignorable="w14 w15 w16se w16cid w16 w16cex w16sdtdh w16sdtfl w16du wp14">
   <w:p>
     <w:pPr>
       <w:pStyle w:val="Header"/>
@@ -7734,7 +7470,7 @@
 </file>
 
 <file path=word/numbering.xml><?xml version="1.0" encoding="utf-8"?>
-<w:numbering xmlns:wpc="http://schemas.microsoft.com/office/word/2010/wordprocessingCanvas" xmlns:cx="http://schemas.microsoft.com/office/drawing/2014/chartex" xmlns:cx1="http://schemas.microsoft.com/office/drawing/2015/9/8/chartex" xmlns:cx2="http://schemas.microsoft.com/office/drawing/2015/10/21/chartex" xmlns:cx3="http://schemas.microsoft.com/office/drawing/2016/5/9/chartex" xmlns:cx4="http://schemas.microsoft.com/office/drawing/2016/5/10/chartex" xmlns:cx5="http://schemas.microsoft.com/office/drawing/2016/5/11/chartex" xmlns:cx6="http://schemas.microsoft.com/office/drawing/2016/5/12/chartex" xmlns:cx7="http://schemas.microsoft.com/office/drawing/2016/5/13/chartex" xmlns:cx8="http://schemas.microsoft.com/office/drawing/2016/5/14/chartex" xmlns:mc="http://schemas.openxmlformats.org/markup-compatibility/2006" xmlns:aink="http://schemas.microsoft.com/office/drawing/2016/ink" xmlns:am3d="http://schemas.microsoft.com/office/drawing/2017/model3d" xmlns:o="urn:schemas-microsoft-com:office:office" xmlns:oel="http://schemas.microsoft.com/office/2019/extlst" xmlns:r="http://schemas.openxmlformats.org/officeDocument/2006/relationships" xmlns:m="http://schemas.openxmlformats.org/officeDocument/2006/math" xmlns:v="urn:schemas-microsoft-com:vml" xmlns:wp14="http://schemas.microsoft.com/office/word/2010/wordprocessingDrawing" xmlns:wp="http://schemas.openxmlformats.org/drawingml/2006/wordprocessingDrawing" xmlns:w10="urn:schemas-microsoft-com:office:word" xmlns:w="http://schemas.openxmlformats.org/wordprocessingml/2006/main" xmlns:w14="http://schemas.microsoft.com/office/word/2010/wordml" xmlns:w15="http://schemas.microsoft.com/office/word/2012/wordml" xmlns:w16cex="http://schemas.microsoft.com/office/word/2018/wordml/cex" xmlns:w16cid="http://schemas.microsoft.com/office/word/2016/wordml/cid" xmlns:w16="http://schemas.microsoft.com/office/word/2018/wordml" xmlns:w16sdtdh="http://schemas.microsoft.com/office/word/2020/wordml/sdtdatahash" xmlns:w16se="http://schemas.microsoft.com/office/word/2015/wordml/symex" xmlns:wpg="http://schemas.microsoft.com/office/word/2010/wordprocessingGroup" xmlns:wpi="http://schemas.microsoft.com/office/word/2010/wordprocessingInk" xmlns:wne="http://schemas.microsoft.com/office/word/2006/wordml" xmlns:wps="http://schemas.microsoft.com/office/word/2010/wordprocessingShape" mc:Ignorable="w14 w15 w16se w16cid w16 w16cex w16sdtdh wp14">
+<w:numbering xmlns:wpc="http://schemas.microsoft.com/office/word/2010/wordprocessingCanvas" xmlns:cx="http://schemas.microsoft.com/office/drawing/2014/chartex" xmlns:cx1="http://schemas.microsoft.com/office/drawing/2015/9/8/chartex" xmlns:cx2="http://schemas.microsoft.com/office/drawing/2015/10/21/chartex" xmlns:cx3="http://schemas.microsoft.com/office/drawing/2016/5/9/chartex" xmlns:cx4="http://schemas.microsoft.com/office/drawing/2016/5/10/chartex" xmlns:cx5="http://schemas.microsoft.com/office/drawing/2016/5/11/chartex" xmlns:cx6="http://schemas.microsoft.com/office/drawing/2016/5/12/chartex" xmlns:cx7="http://schemas.microsoft.com/office/drawing/2016/5/13/chartex" xmlns:cx8="http://schemas.microsoft.com/office/drawing/2016/5/14/chartex" xmlns:mc="http://schemas.openxmlformats.org/markup-compatibility/2006" xmlns:aink="http://schemas.microsoft.com/office/drawing/2016/ink" xmlns:am3d="http://schemas.microsoft.com/office/drawing/2017/model3d" xmlns:o="urn:schemas-microsoft-com:office:office" xmlns:oel="http://schemas.microsoft.com/office/2019/extlst" xmlns:r="http://schemas.openxmlformats.org/officeDocument/2006/relationships" xmlns:m="http://schemas.openxmlformats.org/officeDocument/2006/math" xmlns:v="urn:schemas-microsoft-com:vml" xmlns:wp14="http://schemas.microsoft.com/office/word/2010/wordprocessingDrawing" xmlns:wp="http://schemas.openxmlformats.org/drawingml/2006/wordprocessingDrawing" xmlns:w10="urn:schemas-microsoft-com:office:word" xmlns:w="http://schemas.openxmlformats.org/wordprocessingml/2006/main" xmlns:w14="http://schemas.microsoft.com/office/word/2010/wordml" xmlns:w15="http://schemas.microsoft.com/office/word/2012/wordml" xmlns:w16cex="http://schemas.microsoft.com/office/word/2018/wordml/cex" xmlns:w16cid="http://schemas.microsoft.com/office/word/2016/wordml/cid" xmlns:w16="http://schemas.microsoft.com/office/word/2018/wordml" xmlns:w16du="http://schemas.microsoft.com/office/word/2023/wordml/word16du" xmlns:w16sdtdh="http://schemas.microsoft.com/office/word/2020/wordml/sdtdatahash" xmlns:w16sdtfl="http://schemas.microsoft.com/office/word/2024/wordml/sdtformatlock" xmlns:w16se="http://schemas.microsoft.com/office/word/2015/wordml/symex" xmlns:wpg="http://schemas.microsoft.com/office/word/2010/wordprocessingGroup" xmlns:wpi="http://schemas.microsoft.com/office/word/2010/wordprocessingInk" xmlns:wne="http://schemas.microsoft.com/office/word/2006/wordml" xmlns:wps="http://schemas.microsoft.com/office/word/2010/wordprocessingShape" mc:Ignorable="w14 w15 w16se w16cid w16 w16cex w16sdtdh w16sdtfl w16du wp14">
   <w:abstractNum w:abstractNumId="0" w15:restartNumberingAfterBreak="0">
     <w:nsid w:val="05454A56"/>
     <w:multiLevelType w:val="hybridMultilevel"/>
@@ -9685,7 +9421,7 @@
 </file>
 
 <file path=word/styles.xml><?xml version="1.0" encoding="utf-8"?>
-<w:styles xmlns:mc="http://schemas.openxmlformats.org/markup-compatibility/2006" xmlns:r="http://schemas.openxmlformats.org/officeDocument/2006/relationships" xmlns:w="http://schemas.openxmlformats.org/wordprocessingml/2006/main" xmlns:w14="http://schemas.microsoft.com/office/word/2010/wordml" xmlns:w15="http://schemas.microsoft.com/office/word/2012/wordml" xmlns:w16cex="http://schemas.microsoft.com/office/word/2018/wordml/cex" xmlns:w16cid="http://schemas.microsoft.com/office/word/2016/wordml/cid" xmlns:w16="http://schemas.microsoft.com/office/word/2018/wordml" xmlns:w16sdtdh="http://schemas.microsoft.com/office/word/2020/wordml/sdtdatahash" xmlns:w16se="http://schemas.microsoft.com/office/word/2015/wordml/symex" mc:Ignorable="w14 w15 w16se w16cid w16 w16cex w16sdtdh">
+<w:styles xmlns:mc="http://schemas.openxmlformats.org/markup-compatibility/2006" xmlns:r="http://schemas.openxmlformats.org/officeDocument/2006/relationships" xmlns:w="http://schemas.openxmlformats.org/wordprocessingml/2006/main" xmlns:w14="http://schemas.microsoft.com/office/word/2010/wordml" xmlns:w15="http://schemas.microsoft.com/office/word/2012/wordml" xmlns:w16cex="http://schemas.microsoft.com/office/word/2018/wordml/cex" xmlns:w16cid="http://schemas.microsoft.com/office/word/2016/wordml/cid" xmlns:w16="http://schemas.microsoft.com/office/word/2018/wordml" xmlns:w16du="http://schemas.microsoft.com/office/word/2023/wordml/word16du" xmlns:w16sdtdh="http://schemas.microsoft.com/office/word/2020/wordml/sdtdatahash" xmlns:w16sdtfl="http://schemas.microsoft.com/office/word/2024/wordml/sdtformatlock" xmlns:w16se="http://schemas.microsoft.com/office/word/2015/wordml/symex" mc:Ignorable="w14 w15 w16se w16cid w16 w16cex w16sdtdh w16sdtfl w16du">
   <w:docDefaults>
     <w:rPrDefault>
       <w:rPr>
@@ -10900,6 +10636,10 @@
 </file>
 
 <file path=customXml/item1.xml><?xml version="1.0" encoding="utf-8"?>
+<b:Sources xmlns:b="http://schemas.openxmlformats.org/officeDocument/2006/bibliography" xmlns="http://schemas.openxmlformats.org/officeDocument/2006/bibliography" SelectedStyle="/APASixthEditionOfficeOnline.xsl" StyleName="APA" Version="6"/>
+</file>
+
+<file path=customXml/item2.xml><?xml version="1.0" encoding="utf-8"?>
 <ct:contentTypeSchema xmlns:ct="http://schemas.microsoft.com/office/2006/metadata/contentType" xmlns:ma="http://schemas.microsoft.com/office/2006/metadata/properties/metaAttributes" ct:_="" ma:_="" ma:contentTypeName="Document" ma:contentTypeID="0x010100D23CB377CC937043B7A9F1C20506A289" ma:contentTypeVersion="13" ma:contentTypeDescription="Create a new document." ma:contentTypeScope="" ma:versionID="68080a93dc2759df630fd44e7a69cd93">
   <xsd:schema xmlns:xsd="http://www.w3.org/2001/XMLSchema" xmlns:xs="http://www.w3.org/2001/XMLSchema" xmlns:p="http://schemas.microsoft.com/office/2006/metadata/properties" xmlns:ns2="9db57d92-8734-4c2b-8467-7c469d01b44d" xmlns:ns3="ca6dbe48-f423-44d5-85ee-70a4155a7cdb" targetNamespace="http://schemas.microsoft.com/office/2006/metadata/properties" ma:root="true" ma:fieldsID="478aafb22057cade2ee67d452293f300" ns2:_="" ns3:_="">
     <xsd:import namespace="9db57d92-8734-4c2b-8467-7c469d01b44d"/>
@@ -11124,7 +10864,7 @@
 </ct:contentTypeSchema>
 </file>
 
-<file path=customXml/item2.xml><?xml version="1.0" encoding="utf-8"?>
+<file path=customXml/item3.xml><?xml version="1.0" encoding="utf-8"?>
 <p:properties xmlns:p="http://schemas.microsoft.com/office/2006/metadata/properties" xmlns:xsi="http://www.w3.org/2001/XMLSchema-instance" xmlns:pc="http://schemas.microsoft.com/office/infopath/2007/PartnerControls">
   <documentManagement>
     <TaxKeywordTaxHTField xmlns="9db57d92-8734-4c2b-8467-7c469d01b44d">
@@ -11142,7 +10882,7 @@
 </p:properties>
 </file>
 
-<file path=customXml/item3.xml><?xml version="1.0" encoding="utf-8"?>
+<file path=customXml/item4.xml><?xml version="1.0" encoding="utf-8"?>
 <?mso-contentType ?>
 <FormTemplates xmlns="http://schemas.microsoft.com/sharepoint/v3/contenttype/forms">
   <Display>DocumentLibraryForm</Display>
@@ -11151,11 +10891,15 @@
 </FormTemplates>
 </file>
 
-<file path=customXml/item4.xml><?xml version="1.0" encoding="utf-8"?>
-<b:Sources xmlns:b="http://schemas.openxmlformats.org/officeDocument/2006/bibliography" xmlns="http://schemas.openxmlformats.org/officeDocument/2006/bibliography" SelectedStyle="/APASixthEditionOfficeOnline.xsl" StyleName="APA" Version="6"/>
+<file path=customXml/itemProps1.xml><?xml version="1.0" encoding="utf-8"?>
+<ds:datastoreItem xmlns:ds="http://schemas.openxmlformats.org/officeDocument/2006/customXml" ds:itemID="{85D104F2-A782-0646-A40C-0ABDA153D7AB}">
+  <ds:schemaRefs>
+    <ds:schemaRef ds:uri="http://schemas.openxmlformats.org/officeDocument/2006/bibliography"/>
+  </ds:schemaRefs>
+</ds:datastoreItem>
 </file>
 
-<file path=customXml/itemProps1.xml><?xml version="1.0" encoding="utf-8"?>
+<file path=customXml/itemProps2.xml><?xml version="1.0" encoding="utf-8"?>
 <ds:datastoreItem xmlns:ds="http://schemas.openxmlformats.org/officeDocument/2006/customXml" ds:itemID="{1C9B2933-DE27-4735-91E0-26D4009671C8}">
   <ds:schemaRefs>
     <ds:schemaRef ds:uri="http://schemas.microsoft.com/office/2006/metadata/contentType"/>
@@ -11174,7 +10918,7 @@
 </ds:datastoreItem>
 </file>
 
-<file path=customXml/itemProps2.xml><?xml version="1.0" encoding="utf-8"?>
+<file path=customXml/itemProps3.xml><?xml version="1.0" encoding="utf-8"?>
 <ds:datastoreItem xmlns:ds="http://schemas.openxmlformats.org/officeDocument/2006/customXml" ds:itemID="{B3F44BF1-1D50-4A63-8480-B80236099569}">
   <ds:schemaRefs>
     <ds:schemaRef ds:uri="http://schemas.microsoft.com/office/2006/metadata/properties"/>
@@ -11184,18 +10928,10 @@
 </ds:datastoreItem>
 </file>
 
-<file path=customXml/itemProps3.xml><?xml version="1.0" encoding="utf-8"?>
+<file path=customXml/itemProps4.xml><?xml version="1.0" encoding="utf-8"?>
 <ds:datastoreItem xmlns:ds="http://schemas.openxmlformats.org/officeDocument/2006/customXml" ds:itemID="{8F56EBE2-7149-458C-A43B-9F161217BC5F}">
   <ds:schemaRefs>
     <ds:schemaRef ds:uri="http://schemas.microsoft.com/sharepoint/v3/contenttype/forms"/>
   </ds:schemaRefs>
 </ds:datastoreItem>
-</file>
-
-<file path=customXml/itemProps4.xml><?xml version="1.0" encoding="utf-8"?>
-<ds:datastoreItem xmlns:ds="http://schemas.openxmlformats.org/officeDocument/2006/customXml" ds:itemID="{85D104F2-A782-0646-A40C-0ABDA153D7AB}">
-  <ds:schemaRefs>
-    <ds:schemaRef ds:uri="http://schemas.openxmlformats.org/officeDocument/2006/bibliography"/>
-  </ds:schemaRefs>
-</ds:datastoreItem>
 </file>
</xml_diff>